<commit_message>
Implement stage 03 ticket inventory and cinema seat preview
</commit_message>
<xml_diff>
--- a/tiến độn.docx
+++ b/tiến độn.docx
@@ -128,7 +128,7 @@
           <w:color w:val="000000"/>
           <w:sz w:val="20"/>
         </w:rPr>
-        <w:t>Hoàn tất 2 trên 12 giai đoạn. Giai đoạn tiếp theo là 03. Bấm vào ô trong Word để đánh X khi nghiệm thu.</w:t>
+        <w:t>Hoàn tất 3 trên 12 giai đoạn. Giai đoạn tiếp theo là 04. Bấm vào ô trong Word để đánh X khi nghiệm thu.</w:t>
       </w:r>
     </w:p>
     <w:tbl>
@@ -625,7 +625,7 @@
                 <w:tag w:val="progress-03"/>
                 <w:alias w:val="Hoàn tất giai đoạn 03"/>
                 <w14:checkbox>
-                  <w14:checked w14:val="0"/>
+                  <w14:checked w14:val="1"/>
                   <w14:checkedState w14:val="2612" w14:font="Segoe UI Symbol"/>
                   <w14:uncheckedState w14:val="2610" w14:font="Segoe UI Symbol"/>
                 </w14:checkbox>
@@ -636,7 +636,7 @@
                     <w:rFonts w:ascii="Segoe UI Symbol" w:hAnsi="Segoe UI Symbol"/>
                     <w:sz w:val="30"/>
                   </w:rPr>
-                  <w:t>☐</w:t>
+                  <w:t>☒</w:t>
                 </w:r>
               </w:sdtContent>
             </w:sdt>

</xml_diff>

<commit_message>
Add ticket checkout and admin customer records
</commit_message>
<xml_diff>
--- a/tiến độn.docx
+++ b/tiến độn.docx
@@ -15,7 +15,7 @@
         <w:pStyle w:val="Subtitle"/>
       </w:pPr>
       <w:r>
-        <w:t>Phần việc bán vé thanh toán check in và bình chọn</w:t>
+        <w:t>Phần việc mua vé lưu dữ liệu và bình chọn theo bổ sung</w:t>
       </w:r>
     </w:p>
     <w:p>
@@ -25,11 +25,10 @@
       <w:r>
         <w:rPr>
           <w:rFonts w:ascii="Arial" w:hAnsi="Arial" w:eastAsia="Arial" w:cs="Arial"/>
-          <w:b w:val="0"/>
           <w:color w:val="000000"/>
           <w:sz w:val="20"/>
         </w:rPr>
-        <w:t>Nguồn nhiệm vụ: skill/Nhiemvu.md. Ngày lập: 13/10/2026. Kế hoạch có 12 giai đoạn; các ô hoàn tất ban đầu để trống.</w:t>
+        <w:t>Nguồn: skill/bosung.docx, skill ftu-ticket-sales và xác nhận mới nhất. Cập nhật 14/10/2026; mùa/lịch 2027. Nghiệm thu luồng bổ sung local bằng dữ liệu giả và DEMO; không là nghiệm thu production.</w:t>
       </w:r>
     </w:p>
     <w:p>
@@ -47,20 +46,19 @@
       <w:r>
         <w:rPr>
           <w:rFonts w:ascii="Arial" w:hAnsi="Arial" w:eastAsia="Arial" w:cs="Arial"/>
-          <w:b/>
           <w:color w:val="000000"/>
           <w:sz w:val="22"/>
+          <w:b/>
         </w:rPr>
-        <w:t xml:space="preserve">Một giai đoạn mỗi lần: </w:t>
+        <w:t>Phạm vi lượt này:</w:t>
       </w:r>
       <w:r>
         <w:rPr>
           <w:rFonts w:ascii="Arial" w:hAnsi="Arial" w:eastAsia="Arial" w:cs="Arial"/>
-          <w:b w:val="0"/>
           <w:color w:val="000000"/>
           <w:sz w:val="22"/>
         </w:rPr>
-        <w:t>Mỗi lần chỉ thực thi một giai đoạn theo thứ tự. Chỉ bắt đầu giai đoạn sau khi giai đoạn trước đã hoàn tất và có yêu cầu tiếp tục.</w:t>
+        <w:t xml:space="preserve"> Người dùng yêu cầu hoàn tất tất cả 11 giai đoạn phần việc người thứ hai. Đã thực hiện luồng bổ sung; các lần sau tiếp tục theo yêu cầu mới, không tự mở rộng sang CMS/đăng ký hoặc phần gửi email của bên khác.</w:t>
       </w:r>
     </w:p>
     <w:p>
@@ -93,20 +91,19 @@
       <w:r>
         <w:rPr>
           <w:rFonts w:ascii="Arial" w:hAnsi="Arial" w:eastAsia="Arial" w:cs="Arial"/>
-          <w:b/>
           <w:color w:val="000000"/>
           <w:sz w:val="22"/>
+          <w:b/>
         </w:rPr>
-        <w:t xml:space="preserve">Điểm dừng: </w:t>
+        <w:t>Điểm dừng:</w:t>
       </w:r>
       <w:r>
         <w:rPr>
           <w:rFonts w:ascii="Arial" w:hAnsi="Arial" w:eastAsia="Arial" w:cs="Arial"/>
-          <w:b w:val="0"/>
           <w:color w:val="000000"/>
           <w:sz w:val="22"/>
         </w:rPr>
-        <w:t>Sau khi hoàn tất, cập nhật ô trong bảng, lưu file và dừng. Không tự chuyển sang giai đoạn khác hoặc deploy production.</w:t>
+        <w:t xml:space="preserve"> Local 11/11; lượt sau đã đồng bộ Supabase theo yêu cầu. Chưa đo tải online/deploy/push/thay secret/email/thanh toán thật. Cần tài khoản quản trị và cấu hình tích hợp trước mở bán.</w:t>
       </w:r>
     </w:p>
     <w:p>
@@ -124,11 +121,10 @@
       <w:r>
         <w:rPr>
           <w:rFonts w:ascii="Arial" w:hAnsi="Arial" w:eastAsia="Arial" w:cs="Arial"/>
-          <w:b w:val="0"/>
           <w:color w:val="000000"/>
           <w:sz w:val="20"/>
         </w:rPr>
-        <w:t>Hoàn tất 3 trên 12 giai đoạn. Giai đoạn tiếp theo là 04. Bấm vào ô trong Word để đánh X khi nghiệm thu.</w:t>
+        <w:t>Tiến độ 11/11 hoàn tất theo nghiệm thu local/DEMO. Không còn giai đoạn chờ của phạm vi này. Bằng chứng: docs/supplement-acceptance.md, supplement-verification.json và supplement-runbook.md; tests lịch sử chọn ghế không được dùng thay nghiệm thu mới.</w:t>
       </w:r>
     </w:p>
     <w:tbl>
@@ -549,7 +545,6 @@
             <w:r>
               <w:rPr>
                 <w:rFonts w:ascii="Arial" w:hAnsi="Arial" w:eastAsia="Arial" w:cs="Arial"/>
-                <w:b w:val="0"/>
                 <w:color w:val="000000"/>
                 <w:sz w:val="20"/>
               </w:rPr>
@@ -583,11 +578,10 @@
             <w:r>
               <w:rPr>
                 <w:rFonts w:ascii="Arial" w:hAnsi="Arial" w:eastAsia="Arial" w:cs="Arial"/>
-                <w:b w:val="0"/>
                 <w:color w:val="000000"/>
                 <w:sz w:val="20"/>
               </w:rPr>
-              <w:t>Schema bán vé và vote cùng kiểm thử dữ liệu</w:t>
+              <w:t>Lưu Mã vé Thông tin Minh chứng Loại vé Số lượng Combo</w:t>
             </w:r>
           </w:p>
         </w:tc>
@@ -702,11 +696,10 @@
             <w:r>
               <w:rPr>
                 <w:rFonts w:ascii="Arial" w:hAnsi="Arial" w:eastAsia="Arial" w:cs="Arial"/>
-                <w:b w:val="0"/>
                 <w:color w:val="000000"/>
                 <w:sz w:val="20"/>
               </w:rPr>
-              <w:t>Tồn kho và trang bán vé</w:t>
+              <w:t>Chọn loại vé combo và quản lý tồn kho</w:t>
             </w:r>
           </w:p>
         </w:tc>
@@ -736,11 +729,10 @@
             <w:r>
               <w:rPr>
                 <w:rFonts w:ascii="Arial" w:hAnsi="Arial" w:eastAsia="Arial" w:cs="Arial"/>
-                <w:b w:val="0"/>
                 <w:color w:val="000000"/>
                 <w:sz w:val="20"/>
               </w:rPr>
-              <w:t>Danh sách sự kiện và giữ tồn kho có thời hạn</w:t>
+              <w:t>Chọn loại/cụm vé số lượng và combo; không chọn ghế</w:t>
             </w:r>
           </w:p>
         </w:tc>
@@ -778,7 +770,7 @@
                 <w:tag w:val="progress-04"/>
                 <w:alias w:val="Hoàn tất giai đoạn 04"/>
                 <w14:checkbox>
-                  <w14:checked w14:val="0"/>
+                  <w14:checked w14:val="1"/>
                   <w14:checkedState w14:val="2612" w14:font="Segoe UI Symbol"/>
                   <w14:uncheckedState w14:val="2610" w14:font="Segoe UI Symbol"/>
                 </w14:checkbox>
@@ -789,7 +781,7 @@
                     <w:rFonts w:ascii="Segoe UI Symbol" w:hAnsi="Segoe UI Symbol"/>
                     <w:sz w:val="30"/>
                   </w:rPr>
-                  <w:t>☐</w:t>
+                  <w:t>☒</w:t>
                 </w:r>
               </w:sdtContent>
             </w:sdt>
@@ -855,11 +847,10 @@
             <w:r>
               <w:rPr>
                 <w:rFonts w:ascii="Arial" w:hAnsi="Arial" w:eastAsia="Arial" w:cs="Arial"/>
-                <w:b w:val="0"/>
                 <w:color w:val="000000"/>
                 <w:sz w:val="20"/>
               </w:rPr>
-              <w:t>Đơn hàng và checkout</w:t>
+              <w:t>Form thông tin và các bước Tiếp tục</w:t>
             </w:r>
           </w:p>
         </w:tc>
@@ -889,11 +880,10 @@
             <w:r>
               <w:rPr>
                 <w:rFonts w:ascii="Arial" w:hAnsi="Arial" w:eastAsia="Arial" w:cs="Arial"/>
-                <w:b w:val="0"/>
                 <w:color w:val="000000"/>
                 <w:sz w:val="20"/>
               </w:rPr>
-              <w:t>API orders và checkout với giá do server tính</w:t>
+              <w:t>Bảy thông tin QR minh chứng và Hoàn tất lưu dữ liệu</w:t>
             </w:r>
           </w:p>
         </w:tc>
@@ -931,7 +921,7 @@
                 <w:tag w:val="progress-05"/>
                 <w:alias w:val="Hoàn tất giai đoạn 05"/>
                 <w14:checkbox>
-                  <w14:checked w14:val="0"/>
+                  <w14:checked w14:val="1"/>
                   <w14:checkedState w14:val="2612" w14:font="Segoe UI Symbol"/>
                   <w14:uncheckedState w14:val="2610" w14:font="Segoe UI Symbol"/>
                 </w14:checkbox>
@@ -942,7 +932,7 @@
                     <w:rFonts w:ascii="Segoe UI Symbol" w:hAnsi="Segoe UI Symbol"/>
                     <w:sz w:val="30"/>
                   </w:rPr>
-                  <w:t>☐</w:t>
+                  <w:t>☒</w:t>
                 </w:r>
               </w:sdtContent>
             </w:sdt>
@@ -1008,11 +998,10 @@
             <w:r>
               <w:rPr>
                 <w:rFonts w:ascii="Arial" w:hAnsi="Arial" w:eastAsia="Arial" w:cs="Arial"/>
-                <w:b w:val="0"/>
                 <w:color w:val="000000"/>
                 <w:sz w:val="20"/>
               </w:rPr>
-              <w:t>Thanh toán và webhook</w:t>
+              <w:t>QR chuyển khoản minh chứng và Hoàn tất</w:t>
             </w:r>
           </w:p>
         </w:tc>
@@ -1042,11 +1031,10 @@
             <w:r>
               <w:rPr>
                 <w:rFonts w:ascii="Arial" w:hAnsi="Arial" w:eastAsia="Arial" w:cs="Arial"/>
-                <w:b w:val="0"/>
                 <w:color w:val="000000"/>
                 <w:sz w:val="20"/>
               </w:rPr>
-              <w:t>PaymentProvider cùng adapter và đối soát</w:t>
+              <w:t>Hoàn tất lưu thành công ghi nhận vé để vote ngay</w:t>
             </w:r>
           </w:p>
         </w:tc>
@@ -1084,7 +1072,7 @@
                 <w:tag w:val="progress-06"/>
                 <w:alias w:val="Hoàn tất giai đoạn 06"/>
                 <w14:checkbox>
-                  <w14:checked w14:val="0"/>
+                  <w14:checked w14:val="1"/>
                   <w14:checkedState w14:val="2612" w14:font="Segoe UI Symbol"/>
                   <w14:uncheckedState w14:val="2610" w14:font="Segoe UI Symbol"/>
                 </w14:checkbox>
@@ -1095,7 +1083,7 @@
                     <w:rFonts w:ascii="Segoe UI Symbol" w:hAnsi="Segoe UI Symbol"/>
                     <w:sz w:val="30"/>
                   </w:rPr>
-                  <w:t>☐</w:t>
+                  <w:t>☒</w:t>
                 </w:r>
               </w:sdtContent>
             </w:sdt>
@@ -1161,11 +1149,10 @@
             <w:r>
               <w:rPr>
                 <w:rFonts w:ascii="Arial" w:hAnsi="Arial" w:eastAsia="Arial" w:cs="Arial"/>
-                <w:b w:val="0"/>
                 <w:color w:val="000000"/>
                 <w:sz w:val="20"/>
               </w:rPr>
-              <w:t>Vé QR và email</w:t>
+              <w:t>Danh sách dữ liệu theo mẫu ảnh</w:t>
             </w:r>
           </w:p>
         </w:tc>
@@ -1195,164 +1182,10 @@
             <w:r>
               <w:rPr>
                 <w:rFonts w:ascii="Arial" w:hAnsi="Arial" w:eastAsia="Arial" w:cs="Arial"/>
-                <w:b w:val="0"/>
                 <w:color w:val="000000"/>
                 <w:sz w:val="20"/>
               </w:rPr>
-              <w:t>Vé sau thanh toán cùng trang vé của tôi</w:t>
-            </w:r>
-          </w:p>
-        </w:tc>
-      </w:tr>
-      <w:tr>
-        <w:trPr>
-          <w:cantSplit/>
-        </w:trPr>
-        <w:tc>
-          <w:tcPr>
-            <w:tcW w:type="dxa" w:w="510"/>
-            <w:vAlign w:val="center"/>
-            <w:tcBorders>
-              <w:top w:val="single" w:sz="5" w:color="D9D9D9"/>
-              <w:left w:val="single" w:sz="5" w:color="D9D9D9"/>
-              <w:bottom w:val="single" w:sz="5" w:color="D9D9D9"/>
-              <w:right w:val="single" w:sz="5" w:color="D9D9D9"/>
-            </w:tcBorders>
-            <w:tcMar>
-              <w:top w:w="80" w:type="dxa"/>
-              <w:bottom w:w="80" w:type="dxa"/>
-              <w:left w:w="100" w:type="dxa"/>
-              <w:right w:w="100" w:type="dxa"/>
-            </w:tcMar>
-            <w:shd w:fill="FFFFFF"/>
-          </w:tcPr>
-          <w:p>
-            <w:pPr>
-              <w:spacing w:after="0" w:before="0" w:line="240" w:lineRule="auto"/>
-              <w:jc w:val="center"/>
-            </w:pPr>
-            <w:sdt>
-              <w:sdtPr>
-                <w:id w:val="12007"/>
-                <w:tag w:val="progress-07"/>
-                <w:alias w:val="Hoàn tất giai đoạn 07"/>
-                <w14:checkbox>
-                  <w14:checked w14:val="0"/>
-                  <w14:checkedState w14:val="2612" w14:font="Segoe UI Symbol"/>
-                  <w14:uncheckedState w14:val="2610" w14:font="Segoe UI Symbol"/>
-                </w14:checkbox>
-              </w:sdtPr>
-              <w:sdtContent>
-                <w:r>
-                  <w:rPr>
-                    <w:rFonts w:ascii="Segoe UI Symbol" w:hAnsi="Segoe UI Symbol"/>
-                    <w:sz w:val="30"/>
-                  </w:rPr>
-                  <w:t>☐</w:t>
-                </w:r>
-              </w:sdtContent>
-            </w:sdt>
-          </w:p>
-        </w:tc>
-        <w:tc>
-          <w:tcPr>
-            <w:tcW w:type="dxa" w:w="567"/>
-            <w:vAlign w:val="center"/>
-            <w:tcBorders>
-              <w:top w:val="single" w:sz="5" w:color="D9D9D9"/>
-              <w:left w:val="single" w:sz="5" w:color="D9D9D9"/>
-              <w:bottom w:val="single" w:sz="5" w:color="D9D9D9"/>
-              <w:right w:val="single" w:sz="5" w:color="D9D9D9"/>
-            </w:tcBorders>
-            <w:tcMar>
-              <w:top w:w="80" w:type="dxa"/>
-              <w:bottom w:w="80" w:type="dxa"/>
-              <w:left w:w="100" w:type="dxa"/>
-              <w:right w:w="100" w:type="dxa"/>
-            </w:tcMar>
-            <w:shd w:fill="FFFFFF"/>
-          </w:tcPr>
-          <w:p>
-            <w:pPr>
-              <w:spacing w:after="0" w:before="0" w:line="240" w:lineRule="auto"/>
-              <w:jc w:val="center"/>
-            </w:pPr>
-            <w:r>
-              <w:rPr>
-                <w:rFonts w:ascii="Arial" w:hAnsi="Arial" w:eastAsia="Arial" w:cs="Arial"/>
-                <w:b w:val="0"/>
-                <w:color w:val="000000"/>
-                <w:sz w:val="20"/>
-              </w:rPr>
-              <w:t>07</w:t>
-            </w:r>
-          </w:p>
-        </w:tc>
-        <w:tc>
-          <w:tcPr>
-            <w:tcW w:type="dxa" w:w="3458"/>
-            <w:vAlign w:val="center"/>
-            <w:tcBorders>
-              <w:top w:val="single" w:sz="5" w:color="D9D9D9"/>
-              <w:left w:val="single" w:sz="5" w:color="D9D9D9"/>
-              <w:bottom w:val="single" w:sz="5" w:color="D9D9D9"/>
-              <w:right w:val="single" w:sz="5" w:color="D9D9D9"/>
-            </w:tcBorders>
-            <w:tcMar>
-              <w:top w:w="80" w:type="dxa"/>
-              <w:bottom w:w="80" w:type="dxa"/>
-              <w:left w:w="100" w:type="dxa"/>
-              <w:right w:w="100" w:type="dxa"/>
-            </w:tcMar>
-            <w:shd w:fill="FFFFFF"/>
-          </w:tcPr>
-          <w:p>
-            <w:pPr>
-              <w:spacing w:after="0" w:before="0" w:line="240" w:lineRule="auto"/>
-              <w:jc w:val="left"/>
-            </w:pPr>
-            <w:r>
-              <w:rPr>
-                <w:rFonts w:ascii="Arial" w:hAnsi="Arial" w:eastAsia="Arial" w:cs="Arial"/>
-                <w:b w:val="0"/>
-                <w:color w:val="000000"/>
-                <w:sz w:val="20"/>
-              </w:rPr>
-              <w:t>Check in trên điện thoại</w:t>
-            </w:r>
-          </w:p>
-        </w:tc>
-        <w:tc>
-          <w:tcPr>
-            <w:tcW w:type="dxa" w:w="5102"/>
-            <w:vAlign w:val="center"/>
-            <w:tcBorders>
-              <w:top w:val="single" w:sz="5" w:color="D9D9D9"/>
-              <w:left w:val="single" w:sz="5" w:color="D9D9D9"/>
-              <w:bottom w:val="single" w:sz="5" w:color="D9D9D9"/>
-              <w:right w:val="single" w:sz="5" w:color="D9D9D9"/>
-            </w:tcBorders>
-            <w:tcMar>
-              <w:top w:w="80" w:type="dxa"/>
-              <w:bottom w:w="80" w:type="dxa"/>
-              <w:left w:w="100" w:type="dxa"/>
-              <w:right w:w="100" w:type="dxa"/>
-            </w:tcMar>
-            <w:shd w:fill="FFFFFF"/>
-          </w:tcPr>
-          <w:p>
-            <w:pPr>
-              <w:spacing w:after="0" w:before="0" w:line="240" w:lineRule="auto"/>
-              <w:jc w:val="left"/>
-            </w:pPr>
-            <w:r>
-              <w:rPr>
-                <w:rFonts w:ascii="Arial" w:hAnsi="Arial" w:eastAsia="Arial" w:cs="Arial"/>
-                <w:b w:val="0"/>
-                <w:color w:val="000000"/>
-                <w:sz w:val="20"/>
-              </w:rPr>
-              <w:t>Camera quét vé cùng kiểm tra nguyên tử</w:t>
+              <w:t>Dữ liệu đủ sáu cột để bên khác xử lý thủ công</w:t>
             </w:r>
           </w:p>
         </w:tc>
@@ -1387,10 +1220,10 @@
             <w:sdt>
               <w:sdtPr>
                 <w:id w:val="12008"/>
-                <w:tag w:val="progress-08"/>
+                <w:tag w:val="progress-07"/>
                 <w:alias w:val="Hoàn tất giai đoạn 08"/>
                 <w14:checkbox>
-                  <w14:checked w14:val="0"/>
+                  <w14:checked w14:val="1"/>
                   <w14:checkedState w14:val="2612" w14:font="Segoe UI Symbol"/>
                   <w14:uncheckedState w14:val="2610" w14:font="Segoe UI Symbol"/>
                 </w14:checkbox>
@@ -1401,7 +1234,7 @@
                     <w:rFonts w:ascii="Segoe UI Symbol" w:hAnsi="Segoe UI Symbol"/>
                     <w:sz w:val="30"/>
                   </w:rPr>
-                  <w:t>☐</w:t>
+                  <w:t>☒</w:t>
                 </w:r>
               </w:sdtContent>
             </w:sdt>
@@ -1433,11 +1266,10 @@
             <w:r>
               <w:rPr>
                 <w:rFonts w:ascii="Arial" w:hAnsi="Arial" w:eastAsia="Arial" w:cs="Arial"/>
-                <w:b w:val="0"/>
                 <w:color w:val="000000"/>
                 <w:sz w:val="20"/>
               </w:rPr>
-              <w:t>08</w:t>
+              <w:t>07</w:t>
             </w:r>
           </w:p>
         </w:tc>
@@ -1467,7 +1299,6 @@
             <w:r>
               <w:rPr>
                 <w:rFonts w:ascii="Arial" w:hAnsi="Arial" w:eastAsia="Arial" w:cs="Arial"/>
-                <w:b w:val="0"/>
                 <w:color w:val="000000"/>
                 <w:sz w:val="20"/>
               </w:rPr>
@@ -1501,11 +1332,10 @@
             <w:r>
               <w:rPr>
                 <w:rFonts w:ascii="Arial" w:hAnsi="Arial" w:eastAsia="Arial" w:cs="Arial"/>
-                <w:b w:val="0"/>
                 <w:color w:val="000000"/>
                 <w:sz w:val="20"/>
               </w:rPr>
-              <w:t>Vote theo quy tắc đã chốt cùng chốt kết quả</w:t>
+              <w:t>Vote theo số vé lưu khi Hoàn tất</w:t>
             </w:r>
           </w:p>
         </w:tc>
@@ -1540,10 +1370,10 @@
             <w:sdt>
               <w:sdtPr>
                 <w:id w:val="12009"/>
-                <w:tag w:val="progress-09"/>
+                <w:tag w:val="progress-08"/>
                 <w:alias w:val="Hoàn tất giai đoạn 09"/>
                 <w14:checkbox>
-                  <w14:checked w14:val="0"/>
+                  <w14:checked w14:val="1"/>
                   <w14:checkedState w14:val="2612" w14:font="Segoe UI Symbol"/>
                   <w14:uncheckedState w14:val="2610" w14:font="Segoe UI Symbol"/>
                 </w14:checkbox>
@@ -1554,7 +1384,7 @@
                     <w:rFonts w:ascii="Segoe UI Symbol" w:hAnsi="Segoe UI Symbol"/>
                     <w:sz w:val="30"/>
                   </w:rPr>
-                  <w:t>☐</w:t>
+                  <w:t>☒</w:t>
                 </w:r>
               </w:sdtContent>
             </w:sdt>
@@ -1586,11 +1416,10 @@
             <w:r>
               <w:rPr>
                 <w:rFonts w:ascii="Arial" w:hAnsi="Arial" w:eastAsia="Arial" w:cs="Arial"/>
-                <w:b w:val="0"/>
                 <w:color w:val="000000"/>
                 <w:sz w:val="20"/>
               </w:rPr>
-              <w:t>09</w:t>
+              <w:t>08</w:t>
             </w:r>
           </w:p>
         </w:tc>
@@ -1620,11 +1449,10 @@
             <w:r>
               <w:rPr>
                 <w:rFonts w:ascii="Arial" w:hAnsi="Arial" w:eastAsia="Arial" w:cs="Arial"/>
-                <w:b w:val="0"/>
                 <w:color w:val="000000"/>
                 <w:sz w:val="20"/>
               </w:rPr>
-              <w:t>Dashboard quản trị bán vé</w:t>
+              <w:t>Danh sách quản trị dữ liệu mua vé</w:t>
             </w:r>
           </w:p>
         </w:tc>
@@ -1654,11 +1482,10 @@
             <w:r>
               <w:rPr>
                 <w:rFonts w:ascii="Arial" w:hAnsi="Arial" w:eastAsia="Arial" w:cs="Arial"/>
-                <w:b w:val="0"/>
                 <w:color w:val="000000"/>
                 <w:sz w:val="20"/>
               </w:rPr>
-              <w:t>Quản trị đơn vé thanh toán và vote theo quyền</w:t>
+              <w:t>Hiển thị đúng mẫu ảnh và thống kê loại vé combo</w:t>
             </w:r>
           </w:p>
         </w:tc>
@@ -1693,10 +1520,10 @@
             <w:sdt>
               <w:sdtPr>
                 <w:id w:val="12010"/>
-                <w:tag w:val="progress-10"/>
+                <w:tag w:val="progress-09"/>
                 <w:alias w:val="Hoàn tất giai đoạn 10"/>
                 <w14:checkbox>
-                  <w14:checked w14:val="0"/>
+                  <w14:checked w14:val="1"/>
                   <w14:checkedState w14:val="2612" w14:font="Segoe UI Symbol"/>
                   <w14:uncheckedState w14:val="2610" w14:font="Segoe UI Symbol"/>
                 </w14:checkbox>
@@ -1707,7 +1534,7 @@
                     <w:rFonts w:ascii="Segoe UI Symbol" w:hAnsi="Segoe UI Symbol"/>
                     <w:sz w:val="30"/>
                   </w:rPr>
-                  <w:t>☐</w:t>
+                  <w:t>☒</w:t>
                 </w:r>
               </w:sdtContent>
             </w:sdt>
@@ -1739,11 +1566,10 @@
             <w:r>
               <w:rPr>
                 <w:rFonts w:ascii="Arial" w:hAnsi="Arial" w:eastAsia="Arial" w:cs="Arial"/>
-                <w:b w:val="0"/>
                 <w:color w:val="000000"/>
                 <w:sz w:val="20"/>
               </w:rPr>
-              <w:t>10</w:t>
+              <w:t>09</w:t>
             </w:r>
           </w:p>
         </w:tc>
@@ -1807,11 +1633,10 @@
             <w:r>
               <w:rPr>
                 <w:rFonts w:ascii="Arial" w:hAnsi="Arial" w:eastAsia="Arial" w:cs="Arial"/>
-                <w:b w:val="0"/>
                 <w:color w:val="000000"/>
                 <w:sz w:val="20"/>
               </w:rPr>
-              <w:t>Kịch bản k6 và báo cáo benchmark</w:t>
+              <w:t>Benchmark Hono PostgreSQL local và báo cáo tải</w:t>
             </w:r>
           </w:p>
         </w:tc>
@@ -1846,10 +1671,10 @@
             <w:sdt>
               <w:sdtPr>
                 <w:id w:val="12011"/>
-                <w:tag w:val="progress-11"/>
+                <w:tag w:val="progress-10"/>
                 <w:alias w:val="Hoàn tất giai đoạn 11"/>
                 <w14:checkbox>
-                  <w14:checked w14:val="0"/>
+                  <w14:checked w14:val="1"/>
                   <w14:checkedState w14:val="2612" w14:font="Segoe UI Symbol"/>
                   <w14:uncheckedState w14:val="2610" w14:font="Segoe UI Symbol"/>
                 </w14:checkbox>
@@ -1860,7 +1685,7 @@
                     <w:rFonts w:ascii="Segoe UI Symbol" w:hAnsi="Segoe UI Symbol"/>
                     <w:sz w:val="30"/>
                   </w:rPr>
-                  <w:t>☐</w:t>
+                  <w:t>☒</w:t>
                 </w:r>
               </w:sdtContent>
             </w:sdt>
@@ -1892,11 +1717,10 @@
             <w:r>
               <w:rPr>
                 <w:rFonts w:ascii="Arial" w:hAnsi="Arial" w:eastAsia="Arial" w:cs="Arial"/>
-                <w:b w:val="0"/>
                 <w:color w:val="000000"/>
                 <w:sz w:val="20"/>
               </w:rPr>
-              <w:t>11</w:t>
+              <w:t>10</w:t>
             </w:r>
           </w:p>
         </w:tc>
@@ -1999,10 +1823,10 @@
             <w:sdt>
               <w:sdtPr>
                 <w:id w:val="12012"/>
-                <w:tag w:val="progress-12"/>
+                <w:tag w:val="progress-11"/>
                 <w:alias w:val="Hoàn tất giai đoạn 12"/>
                 <w14:checkbox>
-                  <w14:checked w14:val="0"/>
+                  <w14:checked w14:val="1"/>
                   <w14:checkedState w14:val="2612" w14:font="Segoe UI Symbol"/>
                   <w14:uncheckedState w14:val="2610" w14:font="Segoe UI Symbol"/>
                 </w14:checkbox>
@@ -2013,7 +1837,7 @@
                     <w:rFonts w:ascii="Segoe UI Symbol" w:hAnsi="Segoe UI Symbol"/>
                     <w:sz w:val="30"/>
                   </w:rPr>
-                  <w:t>☐</w:t>
+                  <w:t>☒</w:t>
                 </w:r>
               </w:sdtContent>
             </w:sdt>
@@ -2045,11 +1869,10 @@
             <w:r>
               <w:rPr>
                 <w:rFonts w:ascii="Arial" w:hAnsi="Arial" w:eastAsia="Arial" w:cs="Arial"/>
-                <w:b w:val="0"/>
                 <w:color w:val="000000"/>
                 <w:sz w:val="20"/>
               </w:rPr>
-              <w:t>12</w:t>
+              <w:t>11</w:t>
             </w:r>
           </w:p>
         </w:tc>
@@ -2124,13 +1947,9 @@
       </w:tr>
     </w:tbl>
     <w:p>
-      <w:r>
-        <w:br w:type="page"/>
-      </w:r>
-    </w:p>
-    <w:p>
       <w:pPr>
         <w:pStyle w:val="Heading1"/>
+        <w:pageBreakBefore/>
       </w:pPr>
       <w:r>
         <w:t>Chuẩn bị dữ liệu và đặt vé</w:t>
@@ -2151,20 +1970,19 @@
       <w:r>
         <w:rPr>
           <w:rFonts w:ascii="Arial" w:hAnsi="Arial" w:eastAsia="Arial" w:cs="Arial"/>
-          <w:b/>
           <w:color w:val="000000"/>
           <w:sz w:val="22"/>
+          <w:b/>
         </w:rPr>
-        <w:t xml:space="preserve">Công việc: </w:t>
+        <w:t>Công việc:</w:t>
       </w:r>
       <w:r>
         <w:rPr>
           <w:rFonts w:ascii="Arial" w:hAnsi="Arial" w:eastAsia="Arial" w:cs="Arial"/>
-          <w:b w:val="0"/>
           <w:color w:val="000000"/>
           <w:sz w:val="22"/>
         </w:rPr>
-        <w:t>Đọc code, API contract, design system và phần công việc được phân công. Lập docs/implementation-plan-person-2.md, chỉ rõ module sở hữu và điểm tích hợp với auth, UI, Zod, notification và schema chung.</w:t>
+        <w:t xml:space="preserve"> R01–R14. Contract đúng luồng bổ sung và ba ảnh: loại/combo → thông tin → QR → minh chứng → Hoàn tất lưu database, có quyền vote ngay. Email thủ công thuộc bên khác.</w:t>
       </w:r>
     </w:p>
     <w:p>
@@ -2174,20 +1992,19 @@
       <w:r>
         <w:rPr>
           <w:rFonts w:ascii="Arial" w:hAnsi="Arial" w:eastAsia="Arial" w:cs="Arial"/>
-          <w:b/>
           <w:color w:val="000000"/>
           <w:sz w:val="22"/>
+          <w:b/>
         </w:rPr>
-        <w:t xml:space="preserve">Kiểm tra và giới hạn: </w:t>
+        <w:t>Kiểm tra và giới hạn:</w:t>
       </w:r>
       <w:r>
         <w:rPr>
           <w:rFonts w:ascii="Arial" w:hAnsi="Arial" w:eastAsia="Arial" w:cs="Arial"/>
-          <w:b w:val="0"/>
           <w:color w:val="000000"/>
           <w:sz w:val="22"/>
         </w:rPr>
-        <w:t>Thống nhất cách vote: tài khoản theo hạng mục trong nhiệm vụ khác với vé đã check-in theo vòng trong code. Chốt giá, thời gian, hoàn hủy, điều kiện cấp vé và hạng mục; payOS ưu tiên, SePay là adapter thay thế. Chọn ghế đánh số chỉ khi BTC yêu cầu.</w:t>
+        <w:t xml:space="preserve"> Không chọn ghế, không giới hạn tổng vé/tài khoản. Không thêm check-in, provider/webhook hoặc email vé tự động. Mẫu dữ liệu và timeline lấy đúng các ảnh bổ sung.</w:t>
       </w:r>
     </w:p>
     <w:p>
@@ -2197,20 +2014,19 @@
       <w:r>
         <w:rPr>
           <w:rFonts w:ascii="Arial" w:hAnsi="Arial" w:eastAsia="Arial" w:cs="Arial"/>
-          <w:b/>
           <w:color w:val="000000"/>
           <w:sz w:val="22"/>
+          <w:b/>
         </w:rPr>
-        <w:t xml:space="preserve">Điều kiện đánh X: </w:t>
+        <w:t>Điều kiện đánh X:</w:t>
       </w:r>
       <w:r>
         <w:rPr>
           <w:rFonts w:ascii="Arial" w:hAnsi="Arial" w:eastAsia="Arial" w:cs="Arial"/>
-          <w:b w:val="0"/>
           <w:color w:val="000000"/>
           <w:sz w:val="22"/>
         </w:rPr>
-        <w:t>Kế hoạch, contract và những quyết định còn mâu thuẫn đã được xác nhận; không còn giả định nghiệp vụ ngăn thiết kế database.</w:t>
+        <w:t xml:space="preserve"> Đã đạt. Contract và ownership theo R01–R14 đã chốt: lịch 2027, quota 30 phút, không cap mỗi đơn/tài khoản ngoài quota, Hoàn tất có vote ngay, không hủy/thu hồi, BTC cấu hình và DEMO local.</w:t>
       </w:r>
     </w:p>
     <w:p>
@@ -2228,20 +2044,19 @@
       <w:r>
         <w:rPr>
           <w:rFonts w:ascii="Arial" w:hAnsi="Arial" w:eastAsia="Arial" w:cs="Arial"/>
-          <w:b/>
           <w:color w:val="000000"/>
           <w:sz w:val="22"/>
+          <w:b/>
         </w:rPr>
-        <w:t xml:space="preserve">Công việc: </w:t>
+        <w:t>Công việc:</w:t>
       </w:r>
       <w:r>
         <w:rPr>
           <w:rFonts w:ascii="Arial" w:hAnsi="Arial" w:eastAsia="Arial" w:cs="Arial"/>
-          <w:b w:val="0"/>
           <w:color w:val="000000"/>
           <w:sz w:val="22"/>
         </w:rPr>
-        <w:t>Thiết kế migrations cho events, ticket_categories, ticket_inventory, orders, order_items, order_reservations, payments, payment_events, tickets, checkins, promo_codes và promo_redemptions. Bổ sung schema phiên và hạng mục vote theo contract đã thống nhất.</w:t>
+        <w:t xml:space="preserve"> R04, R06–R09, R14. Lưu sáu cột ảnh: Mã vé, Thông tin, Minh chứng chuyển khoản, Loại vé, Số lượng, Combo; đủ bảy thông tin người mua, đúng tài khoản/vòng và mã không trùng.</w:t>
       </w:r>
     </w:p>
     <w:p>
@@ -2251,20 +2066,19 @@
       <w:r>
         <w:rPr>
           <w:rFonts w:ascii="Arial" w:hAnsi="Arial" w:eastAsia="Arial" w:cs="Arial"/>
-          <w:b/>
           <w:color w:val="000000"/>
           <w:sz w:val="22"/>
+          <w:b/>
         </w:rPr>
-        <w:t xml:space="preserve">Kiểm tra và giới hạn: </w:t>
+        <w:t>Kiểm tra và giới hạn:</w:t>
       </w:r>
       <w:r>
         <w:rPr>
           <w:rFonts w:ascii="Arial" w:hAnsi="Arial" w:eastAsia="Arial" w:cs="Arial"/>
-          <w:b w:val="0"/>
           <w:color w:val="000000"/>
           <w:sz w:val="22"/>
         </w:rPr>
-        <w:t>Tái sử dụng schema chung; thay đổi bảng tickets hoặc votes hiện hữu phải có proposal thống nhất. Dùng tiền nguyên VND, snapshot giá, PK, FK, UNIQUE, CHECK, indexes, RLS và GRANT. Ghế và seat_holds là tùy chọn.</w:t>
+        <w:t xml:space="preserve"> Migration giữ dữ liệu cũ, dùng Auth và tickets/votes chung. Đã đồng bộ chín migration lên Supabase; schema/quyền/history khớp local. Dữ liệu và minh chứng riêng tư; Hoàn tất nguyên tử. Xem docs/supabase-sync-20261014.md.</w:t>
       </w:r>
     </w:p>
     <w:p>
@@ -2274,20 +2088,19 @@
       <w:r>
         <w:rPr>
           <w:rFonts w:ascii="Arial" w:hAnsi="Arial" w:eastAsia="Arial" w:cs="Arial"/>
-          <w:b/>
           <w:color w:val="000000"/>
           <w:sz w:val="22"/>
+          <w:b/>
         </w:rPr>
-        <w:t xml:space="preserve">Điều kiện đánh X: </w:t>
+        <w:t>Điều kiện đánh X:</w:t>
       </w:r>
       <w:r>
         <w:rPr>
           <w:rFonts w:ascii="Arial" w:hAnsi="Arial" w:eastAsia="Arial" w:cs="Arial"/>
-          <w:b w:val="0"/>
           <w:color w:val="000000"/>
           <w:sz w:val="22"/>
         </w:rPr>
-        <w:t>Migrations chạy trên database local hoặc test đã xác định; tests xác minh quyền, ràng buộc và rollback. Không phá dữ liệu hoặc sửa schema người thứ nhất khi chưa thống nhất.</w:t>
+        <w:t xml:space="preserve"> Đã đạt. PGlite/HTTP/native PostgreSQL kiểm tra dữ liệu, owner, retry, quota và Hoàn tất nguyên tử; migration rollback sạch/tái áp đạt, guard từ chối rollback khi đã có dữ liệu. Migration mới: 20261014120000_supplement_purchases.sql.</w:t>
       </w:r>
     </w:p>
     <w:p>
@@ -2295,7 +2108,7 @@
         <w:pStyle w:val="Heading2"/>
       </w:pPr>
       <w:r>
-        <w:t>03 Tồn kho và trang bán vé</w:t>
+        <w:t>03 Chọn loại vé combo và quản lý tồn kho</w:t>
       </w:r>
     </w:p>
     <w:p>
@@ -2305,20 +2118,19 @@
       <w:r>
         <w:rPr>
           <w:rFonts w:ascii="Arial" w:hAnsi="Arial" w:eastAsia="Arial" w:cs="Arial"/>
-          <w:b/>
           <w:color w:val="000000"/>
           <w:sz w:val="22"/>
+          <w:b/>
         </w:rPr>
-        <w:t xml:space="preserve">Công việc: </w:t>
+        <w:t>Công việc:</w:t>
       </w:r>
       <w:r>
         <w:rPr>
           <w:rFonts w:ascii="Arial" w:hAnsi="Arial" w:eastAsia="Arial" w:cs="Arial"/>
-          <w:b w:val="0"/>
           <w:color w:val="000000"/>
           <w:sz w:val="22"/>
         </w:rPr>
-        <w:t>Xây danh sách sự kiện, hạng vé, giá và lượng còn lại cho /ve và /ve/:eventSlug. Trạng thái mở bán, hết vé, đóng bán và countdown lấy từ cấu hình và thời gian server.</w:t>
+        <w:t xml:space="preserve"> R01–R03, R12–R14. Chọn loại/cụm, số vé và combo có tích chọn/số combo; không chọn ghế. Hết vé sớm thì khóa/chuyển vé thường theo lịch; vé cùng combo được bố trí gần nhau.</w:t>
       </w:r>
     </w:p>
     <w:p>
@@ -2328,20 +2140,19 @@
       <w:r>
         <w:rPr>
           <w:rFonts w:ascii="Arial" w:hAnsi="Arial" w:eastAsia="Arial" w:cs="Arial"/>
-          <w:b/>
           <w:color w:val="000000"/>
           <w:sz w:val="22"/>
+          <w:b/>
         </w:rPr>
-        <w:t xml:space="preserve">Kiểm tra và giới hạn: </w:t>
+        <w:t>Kiểm tra và giới hạn:</w:t>
       </w:r>
       <w:r>
         <w:rPr>
           <w:rFonts w:ascii="Arial" w:hAnsi="Arial" w:eastAsia="Arial" w:cs="Arial"/>
-          <w:b w:val="0"/>
           <w:color w:val="000000"/>
           <w:sz w:val="22"/>
         </w:rPr>
-        <w:t>Giữ tồn kho bằng transaction với thời hạn; giải phóng reservation hết hạn hoặc bị hủy. Tái sử dụng packages/ui và design system; kiểm thử cạnh tranh khi nhiều người lấy vé cuối.</w:t>
+        <w:t xml:space="preserve"> Giữ quota 30 phút theo database, retry không gia hạn; mỗi đơn/tài khoản chỉ giới hạn bởi quota. BTC cấu hình loại/giá/combo/lịch 2027. Vé sớm cạn khóa loại đó; vé thường đang mở bán theo cấu hình. Không chọn ghế hoặc dùng cap 10 cũ.</w:t>
       </w:r>
     </w:p>
     <w:p>
@@ -2351,20 +2162,19 @@
       <w:r>
         <w:rPr>
           <w:rFonts w:ascii="Arial" w:hAnsi="Arial" w:eastAsia="Arial" w:cs="Arial"/>
-          <w:b/>
           <w:color w:val="000000"/>
           <w:sz w:val="22"/>
+          <w:b/>
         </w:rPr>
-        <w:t xml:space="preserve">Điều kiện đánh X: </w:t>
+        <w:t>Điều kiện đánh X:</w:t>
       </w:r>
       <w:r>
         <w:rPr>
           <w:rFonts w:ascii="Arial" w:hAnsi="Arial" w:eastAsia="Arial" w:cs="Arial"/>
-          <w:b w:val="0"/>
           <w:color w:val="000000"/>
           <w:sz w:val="22"/>
         </w:rPr>
-        <w:t>Tồn kho không âm, không vượt sức chứa và được hoàn lại đúng một lần. Trang bán vé hoạt động trên điện thoại với các trạng thái và dữ liệu thực của môi trường test.</w:t>
+        <w:t xml:space="preserve"> Đã đạt local. UI loại/combo, xem trước mở bán, số lượng trên 10, mobile/keyboard; 20 kết nối tranh quota cuối chỉ một thắng. Counter sold và giữ còn hạn khớp database, không vượt quota.</w:t>
       </w:r>
     </w:p>
     <w:p>
@@ -2372,7 +2182,7 @@
         <w:pStyle w:val="Heading2"/>
       </w:pPr>
       <w:r>
-        <w:t>04 Đơn hàng và checkout</w:t>
+        <w:t>04 Form thông tin và các bước Tiếp tục</w:t>
       </w:r>
     </w:p>
     <w:p>
@@ -2382,20 +2192,19 @@
       <w:r>
         <w:rPr>
           <w:rFonts w:ascii="Arial" w:hAnsi="Arial" w:eastAsia="Arial" w:cs="Arial"/>
-          <w:b/>
           <w:color w:val="000000"/>
           <w:sz w:val="22"/>
+          <w:b/>
         </w:rPr>
-        <w:t xml:space="preserve">Công việc: </w:t>
+        <w:t>Công việc:</w:t>
       </w:r>
       <w:r>
         <w:rPr>
           <w:rFonts w:ascii="Arial" w:hAnsi="Arial" w:eastAsia="Arial" w:cs="Arial"/>
-          <w:b w:val="0"/>
           <w:color w:val="000000"/>
           <w:sz w:val="22"/>
         </w:rPr>
-        <w:t>Xây API tạo, xem, hủy đơn cùng order_items và reservation. Dùng Idempotency-Key, kiểm tra chủ đơn, số lượng và hạn giữ vé. Giá, giảm giá và tổng tiền do server quyết định.</w:t>
+        <w:t xml:space="preserve"> R04–R07, R14. Nhập Tên, Trường, Khóa/lớp, MSSV, Email, SĐT, Facebook trước thanh toán. Tiếp tục thứ nhất mở QR; Tiếp tục thứ hai mở form minh chứng; Hoàn tất gửi lưu.</w:t>
       </w:r>
     </w:p>
     <w:p>
@@ -2405,20 +2214,19 @@
       <w:r>
         <w:rPr>
           <w:rFonts w:ascii="Arial" w:hAnsi="Arial" w:eastAsia="Arial" w:cs="Arial"/>
-          <w:b/>
           <w:color w:val="000000"/>
           <w:sz w:val="22"/>
+          <w:b/>
         </w:rPr>
-        <w:t xml:space="preserve">Kiểm tra và giới hạn: </w:t>
+        <w:t>Kiểm tra và giới hạn:</w:t>
       </w:r>
       <w:r>
         <w:rPr>
           <w:rFonts w:ascii="Arial" w:hAnsi="Arial" w:eastAsia="Arial" w:cs="Arial"/>
-          <w:b w:val="0"/>
           <w:color w:val="000000"/>
           <w:sz w:val="22"/>
         </w:rPr>
-        <w:t>Xây /checkout/:orderId với thông tin đơn, thời gian giữ, chờ thanh toán, hết hạn và cần đối soát. Khách không thể tự đặt đơn PAID; thao tác lặp không tạo nhiều đơn hoặc giữ tồn kho hai lần.</w:t>
+        <w:t xml:space="preserve"> Liên kết thông tin, loại vé, số lượng/combo và ảnh đúng tài khoản/vòng. Không yêu cầu API tạo/xem/hủy đơn công khai hay hoàn tiền ngoài bổ sung; tái sử dụng backend hiện hữu theo contract.</w:t>
       </w:r>
     </w:p>
     <w:p>
@@ -2428,33 +2236,28 @@
       <w:r>
         <w:rPr>
           <w:rFonts w:ascii="Arial" w:hAnsi="Arial" w:eastAsia="Arial" w:cs="Arial"/>
-          <w:b/>
           <w:color w:val="000000"/>
           <w:sz w:val="22"/>
+          <w:b/>
         </w:rPr>
-        <w:t xml:space="preserve">Điều kiện đánh X: </w:t>
+        <w:t>Điều kiện đánh X:</w:t>
       </w:r>
       <w:r>
         <w:rPr>
           <w:rFonts w:ascii="Arial" w:hAnsi="Arial" w:eastAsia="Arial" w:cs="Arial"/>
-          <w:b w:val="0"/>
           <w:color w:val="000000"/>
           <w:sz w:val="22"/>
         </w:rPr>
-        <w:t>Tests đạt cho đặt/hủy/hết hạn, retry, sai quyền, số lượng âm và sửa tiền từ frontend; state machine đơn hàng và thông tin lỗi đã được ghi trong API contract.</w:t>
-      </w:r>
-    </w:p>
-    <w:p>
-      <w:r>
-        <w:br w:type="page"/>
+        <w:t xml:space="preserve"> Đã đạt. Bảy trường validate client/server; hai bước Tiếp tục rồi ảnh/Hoàn tất. Browser desktop/mobile kiểm tra giữ vé, lỗi lưu và retry đúng đơn. Không báo lưu thành công khi thất bại; không gia hạn bằng refresh.</w:t>
       </w:r>
     </w:p>
     <w:p>
       <w:pPr>
         <w:pStyle w:val="Heading1"/>
+        <w:pageBreakBefore/>
       </w:pPr>
       <w:r>
-        <w:t>Thanh toán vé check in và bình chọn</w:t>
+        <w:t>QR chuyển khoản lưu dữ liệu và bình chọn</w:t>
       </w:r>
     </w:p>
     <w:p>
@@ -2462,7 +2265,7 @@
         <w:pStyle w:val="Heading2"/>
       </w:pPr>
       <w:r>
-        <w:t>05 Thanh toán và webhook</w:t>
+        <w:t>05 QR chuyển khoản minh chứng và Hoàn tất</w:t>
       </w:r>
     </w:p>
     <w:p>
@@ -2472,20 +2275,19 @@
       <w:r>
         <w:rPr>
           <w:rFonts w:ascii="Arial" w:hAnsi="Arial" w:eastAsia="Arial" w:cs="Arial"/>
-          <w:b/>
           <w:color w:val="000000"/>
           <w:sz w:val="22"/>
+          <w:b/>
         </w:rPr>
-        <w:t xml:space="preserve">Công việc: </w:t>
+        <w:t>Công việc:</w:t>
       </w:r>
       <w:r>
         <w:rPr>
           <w:rFonts w:ascii="Arial" w:hAnsi="Arial" w:eastAsia="Arial" w:cs="Arial"/>
-          <w:b w:val="0"/>
           <w:color w:val="000000"/>
           <w:sz w:val="22"/>
         </w:rPr>
-        <w:t>Tạo PaymentProvider và adapter payOS theo tài liệu hiện hành; có khả năng thay bằng SePay. Backend tạo yêu cầu thanh toán và VietQR; xác thực webhook, mã đơn, số tiền, tiền tệ, trạng thái và event ID.</w:t>
+        <w:t xml:space="preserve"> R05–R11, R14. Hiển thị QR nhận tiền, tải ảnh minh chứng, bấm Hoàn tất lưu dữ liệu. Khi lưu thành công số vé được tính để vote ngay; không chờ BTC duyệt hoặc email.</w:t>
       </w:r>
     </w:p>
     <w:p>
@@ -2495,20 +2297,19 @@
       <w:r>
         <w:rPr>
           <w:rFonts w:ascii="Arial" w:hAnsi="Arial" w:eastAsia="Arial" w:cs="Arial"/>
-          <w:b/>
           <w:color w:val="000000"/>
           <w:sz w:val="22"/>
+          <w:b/>
         </w:rPr>
-        <w:t xml:space="preserve">Kiểm tra và giới hạn: </w:t>
+        <w:t>Kiểm tra và giới hạn:</w:t>
       </w:r>
       <w:r>
         <w:rPr>
           <w:rFonts w:ascii="Arial" w:hAnsi="Arial" w:eastAsia="Arial" w:cs="Arial"/>
-          <w:b w:val="0"/>
           <w:color w:val="000000"/>
           <w:sz w:val="22"/>
         </w:rPr>
-        <w:t>Kiểm thử webhook trùng, sai chữ ký, tiền thiếu hoặc thừa, trả hai lần, trả muộn, order hết hạn, hết tồn kho, provider timeout và hoàn hủy. Lưu payment_events, audit và trạng thái đối soát. Redirect trình duyệt không xác nhận thanh toán.</w:t>
+        <w:t xml:space="preserve"> Private file được kiểm tra và gắn đúng owner/đơn. Hoàn tất idempotent; quyền vote tách khỏi đối soát tiền. Bên khác đối chiếu/gửi email thủ công. Không tự hoàn tiền hoặc xóa phiếu khi minh chứng sai.</w:t>
       </w:r>
     </w:p>
     <w:p>
@@ -2518,20 +2319,19 @@
       <w:r>
         <w:rPr>
           <w:rFonts w:ascii="Arial" w:hAnsi="Arial" w:eastAsia="Arial" w:cs="Arial"/>
-          <w:b/>
           <w:color w:val="000000"/>
           <w:sz w:val="22"/>
+          <w:b/>
         </w:rPr>
-        <w:t xml:space="preserve">Điều kiện đánh X: </w:t>
+        <w:t>Điều kiện đánh X:</w:t>
       </w:r>
       <w:r>
         <w:rPr>
           <w:rFonts w:ascii="Arial" w:hAnsi="Arial" w:eastAsia="Arial" w:cs="Arial"/>
-          <w:b w:val="0"/>
           <w:color w:val="000000"/>
           <w:sz w:val="22"/>
         </w:rPr>
-        <w:t>Trong sandbox, callback hợp lệ xác nhận payment và order nguyên tử, phát hành quyền nhận vé và ghi outbox. Callback không hợp lệ không cấp vé; retry không xử lý tiền hoặc cấp vé hai lần.</w:t>
+        <w:t xml:space="preserve"> Đã đạt local. JPG/PNG tối đa 5 MB/12 MP xử lý WebP/private; proof đúng owner. Upload riêng chưa có vé. Hoàn tất transaction cấp N vé và audit; lỗi issuance rollback trạng thái/quota/vé. 20 lần Hoàn tất đồng thời không nhân vé.</w:t>
       </w:r>
     </w:p>
     <w:p>
@@ -2539,7 +2339,7 @@
         <w:pStyle w:val="Heading2"/>
       </w:pPr>
       <w:r>
-        <w:t>06 Vé QR và email</w:t>
+        <w:t>06 Danh sách dữ liệu theo mẫu ảnh</w:t>
       </w:r>
     </w:p>
     <w:p>
@@ -2549,20 +2349,19 @@
       <w:r>
         <w:rPr>
           <w:rFonts w:ascii="Arial" w:hAnsi="Arial" w:eastAsia="Arial" w:cs="Arial"/>
-          <w:b/>
           <w:color w:val="000000"/>
           <w:sz w:val="22"/>
+          <w:b/>
         </w:rPr>
-        <w:t xml:space="preserve">Công việc: </w:t>
+        <w:t>Công việc:</w:t>
       </w:r>
       <w:r>
         <w:rPr>
           <w:rFonts w:ascii="Arial" w:hAnsi="Arial" w:eastAsia="Arial" w:cs="Arial"/>
-          <w:b w:val="0"/>
           <w:color w:val="000000"/>
           <w:sz w:val="22"/>
         </w:rPr>
-        <w:t>Phát hành vé từ đơn đã thanh toán hợp lệ, mỗi vé có QR riêng. QR dùng token ngẫu nhiên; database giữ hash, không nhúng email hoặc số điện thoại. Hoàn thiện /tai-khoan/ve, chi tiết, tải QR và gửi lại email.</w:t>
+        <w:t xml:space="preserve"> R07, R08, R10, R14. Danh sách sáu cột đúng ảnh 1; đủ thông tin/ảnh/loại/số lượng/combo, mã vé không trùng. Bên khác lấy dữ liệu để đối chiếu và gửi email thủ công.</w:t>
       </w:r>
     </w:p>
     <w:p>
@@ -2572,20 +2371,19 @@
       <w:r>
         <w:rPr>
           <w:rFonts w:ascii="Arial" w:hAnsi="Arial" w:eastAsia="Arial" w:cs="Arial"/>
-          <w:b/>
           <w:color w:val="000000"/>
           <w:sz w:val="22"/>
+          <w:b/>
         </w:rPr>
-        <w:t xml:space="preserve">Kiểm tra và giới hạn: </w:t>
+        <w:t>Kiểm tra và giới hạn:</w:t>
       </w:r>
       <w:r>
         <w:rPr>
           <w:rFonts w:ascii="Arial" w:hAnsi="Arial" w:eastAsia="Arial" w:cs="Arial"/>
-          <w:b w:val="0"/>
           <w:color w:val="000000"/>
           <w:sz w:val="22"/>
         </w:rPr>
-        <w:t>Tái sử dụng outbox và Resend; có retry, idempotency và trạng thái gửi. Vé thể hiện sự kiện, hạng vé, thời gian, địa điểm và điều kiện sử dụng. Vé bị hoàn tiền hoặc hủy được vô hiệu hóa theo quy tắc đã chốt.</w:t>
+        <w:t xml:space="preserve"> Mã vé không trùng, thông tin/ảnh đúng tài khoản, quyền đọc phù hợp. Không xây QR vào cửa, check-in, mapping QR hay hệ thống gửi/gửi lại email vé. Email thủ công không chặn vote.</w:t>
       </w:r>
     </w:p>
     <w:p>
@@ -2595,20 +2393,19 @@
       <w:r>
         <w:rPr>
           <w:rFonts w:ascii="Arial" w:hAnsi="Arial" w:eastAsia="Arial" w:cs="Arial"/>
-          <w:b/>
           <w:color w:val="000000"/>
           <w:sz w:val="22"/>
+          <w:b/>
         </w:rPr>
-        <w:t xml:space="preserve">Điều kiện đánh X: </w:t>
+        <w:t>Điều kiện đánh X:</w:t>
       </w:r>
       <w:r>
         <w:rPr>
           <w:rFonts w:ascii="Arial" w:hAnsi="Arial" w:eastAsia="Arial" w:cs="Arial"/>
-          <w:b w:val="0"/>
           <w:color w:val="000000"/>
           <w:sz w:val="22"/>
         </w:rPr>
-        <w:t>Tests đạt cho phát hành đúng số lượng, retry không trùng vé, chỉ chủ vé được xem, QR không lộ dữ liệu riêng tư và email thất bại không làm mất vé đã phát hành.</w:t>
+        <w:t xml:space="preserve"> Đã đạt. Danh sách đủ sáu cột, ảnh đúng bản ghi/private; owner hoặc TICKET_STAFF/MFA mới xem. CSV theo trang có chống công thức. Mã yêu cầu và mã con vé duy nhất; chưa nhận email vẫn vote được.</w:t>
       </w:r>
     </w:p>
     <w:p>
@@ -2616,7 +2413,7 @@
         <w:pStyle w:val="Heading2"/>
       </w:pPr>
       <w:r>
-        <w:t>07 Check in trên điện thoại</w:t>
+        <w:t>07 Phiên bình chọn và kết quả</w:t>
       </w:r>
     </w:p>
     <w:p>
@@ -2626,20 +2423,19 @@
       <w:r>
         <w:rPr>
           <w:rFonts w:ascii="Arial" w:hAnsi="Arial" w:eastAsia="Arial" w:cs="Arial"/>
-          <w:b/>
           <w:color w:val="000000"/>
           <w:sz w:val="22"/>
+          <w:b/>
         </w:rPr>
-        <w:t xml:space="preserve">Công việc: </w:t>
+        <w:t>Công việc:</w:t>
       </w:r>
       <w:r>
         <w:rPr>
           <w:rFonts w:ascii="Arial" w:hAnsi="Arial" w:eastAsia="Arial" w:cs="Arial"/>
-          <w:b w:val="0"/>
           <w:color w:val="000000"/>
           <w:sz w:val="22"/>
         </w:rPr>
-        <w:t>Xây /admin/checkin cho CHECKIN_STAFF, chọn sự kiện, camera quét QR, nhập mã dự phòng và thống kê. Hiển thị rõ hợp lệ, đã dùng, sai sự kiện hoặc không hợp lệ; phản hồi âm thanh hoặc rung khi trình duyệt cho phép.</w:t>
+        <w:t xml:space="preserve"> R09, R13, R14. N vé Hoàn tất có N lượt/hạng mục đúng vòng, không cần check-in/duyệt/email. Bán kết 25/4/2027; BTC mở cửa sổ 10 phút theo giờ được cấu hình. Server kiểm tra phiên, category, owner và thời gian sau khóa.</w:t>
       </w:r>
     </w:p>
     <w:p>
@@ -2649,20 +2445,19 @@
       <w:r>
         <w:rPr>
           <w:rFonts w:ascii="Arial" w:hAnsi="Arial" w:eastAsia="Arial" w:cs="Arial"/>
-          <w:b/>
           <w:color w:val="000000"/>
           <w:sz w:val="22"/>
+          <w:b/>
         </w:rPr>
-        <w:t xml:space="preserve">Kiểm tra và giới hạn: </w:t>
+        <w:t>Kiểm tra và giới hạn:</w:t>
       </w:r>
       <w:r>
         <w:rPr>
           <w:rFonts w:ascii="Arial" w:hAnsi="Arial" w:eastAsia="Arial" w:cs="Arial"/>
-          <w:b w:val="0"/>
           <w:color w:val="000000"/>
           <w:sz w:val="22"/>
         </w:rPr>
-        <w:t>Tái sử dụng và mở rộng RPC check-in hiện hữu theo contract. PostgreSQL xác nhận nguyên tử, ghi audit, bảo vệ token và quyền nhân viên. Chuẩn bị mạng dự phòng và quy trình ngoại lệ khi mất kết nối.</w:t>
+        <w:t xml:space="preserve"> Unique vé/hạng mục, vote retry nguyên tử, giữ phiếu cũ chưa có category và chặn vé đó tới khi VOTE_MANAGER đối chiếu. Sau Hoàn tất không hủy/thu hồi. SUPER_ADMIN có lý do mở lại trước chốt, giữ phiếu/lượt; FINALIZED không mở lại.</w:t>
       </w:r>
     </w:p>
     <w:p>
@@ -2672,107 +2467,25 @@
       <w:r>
         <w:rPr>
           <w:rFonts w:ascii="Arial" w:hAnsi="Arial" w:eastAsia="Arial" w:cs="Arial"/>
-          <w:b/>
           <w:color w:val="000000"/>
           <w:sz w:val="22"/>
+          <w:b/>
         </w:rPr>
-        <w:t xml:space="preserve">Điều kiện đánh X: </w:t>
+        <w:t>Điều kiện đánh X:</w:t>
       </w:r>
       <w:r>
         <w:rPr>
           <w:rFonts w:ascii="Arial" w:hAnsi="Arial" w:eastAsia="Arial" w:cs="Arial"/>
-          <w:b w:val="0"/>
           <w:color w:val="000000"/>
           <w:sz w:val="22"/>
         </w:rPr>
-        <w:t>Hai thiết bị quét đồng thời chỉ có một lần thành công; tests đạt cho vé hủy, sai sự kiện, token sai và người không có quyền. Camera và nhập mã đã được thử trên thiết bị mobile phù hợp.</w:t>
-      </w:r>
-    </w:p>
-    <w:p>
-      <w:pPr>
-        <w:pStyle w:val="Heading2"/>
-      </w:pPr>
-      <w:r>
-        <w:t>08 Phiên bình chọn và kết quả</w:t>
-      </w:r>
-    </w:p>
-    <w:p>
-      <w:pPr>
-        <w:spacing w:after="100"/>
-      </w:pPr>
-      <w:r>
-        <w:rPr>
-          <w:rFonts w:ascii="Arial" w:hAnsi="Arial" w:eastAsia="Arial" w:cs="Arial"/>
-          <w:b/>
-          <w:color w:val="000000"/>
-          <w:sz w:val="22"/>
-        </w:rPr>
-        <w:t xml:space="preserve">Công việc: </w:t>
-      </w:r>
-      <w:r>
-        <w:rPr>
-          <w:rFonts w:ascii="Arial" w:hAnsi="Arial" w:eastAsia="Arial" w:cs="Arial"/>
-          <w:b w:val="0"/>
-          <w:color w:val="000000"/>
-          <w:sz w:val="22"/>
-        </w:rPr>
-        <w:t>Mở rộng /binh-chon và API phiên, hạng mục, thí sinh đủ điều kiện, gửi phiếu, phiếu của tôi và quản trị phiên. Countdown theo server; phiên 10 phút có cấu hình, không nhận phiếu trước hoặc sau cửa sổ.</w:t>
-      </w:r>
-    </w:p>
-    <w:p>
-      <w:pPr>
-        <w:spacing w:after="100"/>
-      </w:pPr>
-      <w:r>
-        <w:rPr>
-          <w:rFonts w:ascii="Arial" w:hAnsi="Arial" w:eastAsia="Arial" w:cs="Arial"/>
-          <w:b/>
-          <w:color w:val="000000"/>
-          <w:sz w:val="22"/>
-        </w:rPr>
-        <w:t xml:space="preserve">Kiểm tra và giới hạn: </w:t>
-      </w:r>
-      <w:r>
-        <w:rPr>
-          <w:rFonts w:ascii="Arial" w:hAnsi="Arial" w:eastAsia="Arial" w:cs="Arial"/>
-          <w:b w:val="0"/>
-          <w:color w:val="000000"/>
-          <w:sz w:val="22"/>
-        </w:rPr>
-        <w:t>Áp dụng chính sách phiếu đã thống nhất ở giai đoạn 01. Có UNIQUE và transaction, chống retry và tạo tài khoản hàng loạt; không sửa phiếu đã gửi. Lưu snapshot kết quả, nhật ký sự cố và chỉ công bố khi được phép.</w:t>
-      </w:r>
-    </w:p>
-    <w:p>
-      <w:pPr>
-        <w:spacing w:after="100"/>
-      </w:pPr>
-      <w:r>
-        <w:rPr>
-          <w:rFonts w:ascii="Arial" w:hAnsi="Arial" w:eastAsia="Arial" w:cs="Arial"/>
-          <w:b/>
-          <w:color w:val="000000"/>
-          <w:sz w:val="22"/>
-        </w:rPr>
-        <w:t xml:space="preserve">Điều kiện đánh X: </w:t>
-      </w:r>
-      <w:r>
-        <w:rPr>
-          <w:rFonts w:ascii="Arial" w:hAnsi="Arial" w:eastAsia="Arial" w:cs="Arial"/>
-          <w:b w:val="0"/>
-          <w:color w:val="000000"/>
-          <w:sz w:val="22"/>
-        </w:rPr>
-        <w:t>Tests xác minh phiếu hợp lệ, quyền, thí sinh đủ điều kiện, trùng phiếu và thời điểm đóng phiên. Phiếu đã báo thành công tồn tại đúng một lần; kết quả lấy từ database và người không có quyền không xem được.</w:t>
-      </w:r>
-    </w:p>
-    <w:p>
-      <w:r>
-        <w:br w:type="page"/>
+        <w:t xml:space="preserve"> Đã đạt local. Tests N vé/combo, bán kết/hạng mục, trước/sau Hoàn tất, không check-in, owner, retry, đóng/chốt/công bố. 20 vote retry chỉ một phiếu; browser mua rồi vote đạt. Ngày/giờ thật do BTC cấu hình, fixture local không là lịch thật.</w:t>
       </w:r>
     </w:p>
     <w:p>
       <w:pPr>
         <w:pStyle w:val="Heading1"/>
+        <w:pageBreakBefore/>
       </w:pPr>
       <w:r>
         <w:t>Quản trị kiểm thử và bàn giao</w:t>
@@ -2783,7 +2496,7 @@
         <w:pStyle w:val="Heading2"/>
       </w:pPr>
       <w:r>
-        <w:t>09 Dashboard quản trị bán vé</w:t>
+        <w:t>08 Danh sách quản trị dữ liệu mua vé</w:t>
       </w:r>
     </w:p>
     <w:p>
@@ -2793,20 +2506,19 @@
       <w:r>
         <w:rPr>
           <w:rFonts w:ascii="Arial" w:hAnsi="Arial" w:eastAsia="Arial" w:cs="Arial"/>
-          <w:b/>
           <w:color w:val="000000"/>
           <w:sz w:val="22"/>
+          <w:b/>
         </w:rPr>
-        <w:t xml:space="preserve">Công việc: </w:t>
+        <w:t>Công việc:</w:t>
       </w:r>
       <w:r>
         <w:rPr>
           <w:rFonts w:ascii="Arial" w:hAnsi="Arial" w:eastAsia="Arial" w:cs="Arial"/>
-          <w:b w:val="0"/>
           <w:color w:val="000000"/>
           <w:sz w:val="22"/>
         </w:rPr>
-        <w:t>Xây các trang admin tickets, orders, payments, voting và voting/results; tái sử dụng nền tảng quản trị hiện có. Hiển thị vé bán/còn lại, doanh thu xác nhận, đơn chờ, đối soát, check-in và phiếu theo hạng mục.</w:t>
+        <w:t xml:space="preserve"> R03, R07, R10, R12, R14. Admin có danh sách sáu cột và thống kê theo loại/tier/vòng/Đơn/Combo 2/Combo 3. Người dùng xác nhận ảnh 2 là minh họa; dữ liệu không có Đêm thì bỏ cột, không tự thêm trường hoặc số liệu.</w:t>
       </w:r>
     </w:p>
     <w:p>
@@ -2816,20 +2528,19 @@
       <w:r>
         <w:rPr>
           <w:rFonts w:ascii="Arial" w:hAnsi="Arial" w:eastAsia="Arial" w:cs="Arial"/>
-          <w:b/>
           <w:color w:val="000000"/>
           <w:sz w:val="22"/>
+          <w:b/>
         </w:rPr>
-        <w:t xml:space="preserve">Kiểm tra và giới hạn: </w:t>
+        <w:t>Kiểm tra và giới hạn:</w:t>
       </w:r>
       <w:r>
         <w:rPr>
           <w:rFonts w:ascii="Arial" w:hAnsi="Arial" w:eastAsia="Arial" w:cs="Arial"/>
-          <w:b w:val="0"/>
           <w:color w:val="000000"/>
           <w:sz w:val="22"/>
         </w:rPr>
-        <w:t>Phân quyền thao tác và dữ liệu; staff không sửa trực tiếp kết quả vote. Theo dõi lỗi API và trạng thái phiên. Thao tác hoàn hủy, vô hiệu hóa vé và đối soát phải có audit và giới hạn theo contract.</w:t>
+        <w:t xml:space="preserve"> Danh sách có quyền để bên khác lấy dữ liệu đối chiếu/gửi email thủ công. Không thêm dashboard giao dịch hoặc QR/check-in ngoài bổ sung; không tự đánh doanh thu đã nhận từ ảnh.</w:t>
       </w:r>
     </w:p>
     <w:p>
@@ -2839,20 +2550,19 @@
       <w:r>
         <w:rPr>
           <w:rFonts w:ascii="Arial" w:hAnsi="Arial" w:eastAsia="Arial" w:cs="Arial"/>
-          <w:b/>
           <w:color w:val="000000"/>
           <w:sz w:val="22"/>
+          <w:b/>
         </w:rPr>
-        <w:t xml:space="preserve">Điều kiện đánh X: </w:t>
+        <w:t>Điều kiện đánh X:</w:t>
       </w:r>
       <w:r>
         <w:rPr>
           <w:rFonts w:ascii="Arial" w:hAnsi="Arial" w:eastAsia="Arial" w:cs="Arial"/>
-          <w:b w:val="0"/>
           <w:color w:val="000000"/>
           <w:sz w:val="22"/>
         </w:rPr>
-        <w:t>Số liệu khớp dữ liệu giao dịch test; tests quyền và thao tác đạt. Dashboard dùng được trên mobile, không lộ thông tin riêng tư hoặc cho phép vượt quyền.</w:t>
+        <w:t xml:space="preserve"> Đã đạt. Admin native browser đọc danh sách, ảnh và tổng từ database; HTTP kiểm tra TICKET_STAFF/MFA. Tổng tiền theo đơn không là thực nhận. Không provider/check-in/email vé mới; không còn câu hỏi về Đêm.</w:t>
       </w:r>
     </w:p>
     <w:p>
@@ -2860,7 +2570,7 @@
         <w:pStyle w:val="Heading2"/>
       </w:pPr>
       <w:r>
-        <w:t>10 Kiểm thử tải và hiệu năng</w:t>
+        <w:t>09 Kiểm thử tải và hiệu năng</w:t>
       </w:r>
     </w:p>
     <w:p>
@@ -2870,20 +2580,19 @@
       <w:r>
         <w:rPr>
           <w:rFonts w:ascii="Arial" w:hAnsi="Arial" w:eastAsia="Arial" w:cs="Arial"/>
-          <w:b/>
           <w:color w:val="000000"/>
           <w:sz w:val="22"/>
+          <w:b/>
         </w:rPr>
-        <w:t xml:space="preserve">Công việc: </w:t>
+        <w:t>Công việc:</w:t>
       </w:r>
       <w:r>
         <w:rPr>
           <w:rFonts w:ascii="Arial" w:hAnsi="Arial" w:eastAsia="Arial" w:cs="Arial"/>
-          <w:b w:val="0"/>
           <w:color w:val="000000"/>
           <w:sz w:val="22"/>
         </w:rPr>
-        <w:t>Viết k6 cho 100 người mua vé, 300 người xem vé, 400 người mở và gửi vote trong 10 phút; burst 600–800 người. Kèm thống kê đồng thời, request lúc đóng phiên, retry và các thao tác tranh chấp.</w:t>
+        <w:t xml:space="preserve"> R01–R09, R12, R14. Đo luồng mua/lưu/vote khi được yêu cầu với workload/ngưỡng đã chốt cho mục tiêu 500–1.000; không đưa check-in/email tự động/provider vào benchmark.</w:t>
       </w:r>
     </w:p>
     <w:p>
@@ -2893,20 +2602,19 @@
       <w:r>
         <w:rPr>
           <w:rFonts w:ascii="Arial" w:hAnsi="Arial" w:eastAsia="Arial" w:cs="Arial"/>
-          <w:b/>
           <w:color w:val="000000"/>
           <w:sz w:val="22"/>
+          <w:b/>
         </w:rPr>
-        <w:t xml:space="preserve">Kiểm tra và giới hạn: </w:t>
+        <w:t>Kiểm tra và giới hạn:</w:t>
       </w:r>
       <w:r>
         <w:rPr>
           <w:rFonts w:ascii="Arial" w:hAnsi="Arial" w:eastAsia="Arial" w:cs="Arial"/>
-          <w:b w:val="0"/>
           <w:color w:val="000000"/>
           <w:sz w:val="22"/>
         </w:rPr>
-        <w:t>Chạy trên môi trường test hoặc staging đã được cho phép với workload, thời lượng và dữ liệu xác định. Theo dõi Worker, Auth, CAPTCHA, database và connection pool; không dùng GET localhost để kết luận tải ghi thực tế.</w:t>
+        <w:t xml:space="preserve"> Kịch bản được duyệt local 500→1.000 người, hai phút/mức, 70% xem/20% giữ-minh chứng-Hoàn tất/10% vote theo hành trình; ramp 10 giây, think 4 giây, pool 20. Hono/PostgreSQL thật; Auth/captcha và Images/R2 là test adapter. Không đo Supabase/Cloudflare online.</w:t>
       </w:r>
     </w:p>
     <w:p>
@@ -2916,20 +2624,19 @@
       <w:r>
         <w:rPr>
           <w:rFonts w:ascii="Arial" w:hAnsi="Arial" w:eastAsia="Arial" w:cs="Arial"/>
-          <w:b/>
           <w:color w:val="000000"/>
           <w:sz w:val="22"/>
+          <w:b/>
         </w:rPr>
-        <w:t xml:space="preserve">Điều kiện đánh X: </w:t>
+        <w:t>Điều kiện đánh X:</w:t>
       </w:r>
       <w:r>
         <w:rPr>
           <w:rFonts w:ascii="Arial" w:hAnsi="Arial" w:eastAsia="Arial" w:cs="Arial"/>
-          <w:b w:val="0"/>
           <w:color w:val="000000"/>
           <w:sz w:val="22"/>
         </w:rPr>
-        <w:t>Có báo cáo p95 vote dưới 2 giây, lỗi 5xx dưới 1% ở tải mục tiêu; không mất/trùng phiếu, vượt tồn kho, cấp vé sai hoặc check-in trùng. Nếu chưa đạt, sửa và đo lại trước khi đánh X.</w:t>
+        <w:t xml:space="preserve"> Đã đạt local. 500 p95 14,48 ms/p99 34,54 ms; 1.000 p95 41,26 ms/p99 111,26 ms; lỗi 0. Không vượt quota/trùng mã/trùng phiếu/lệch số vé/counter; deadlocks 0. Không suy kết quả này thành sức tải online.</w:t>
       </w:r>
     </w:p>
     <w:p>
@@ -2937,7 +2644,7 @@
         <w:pStyle w:val="Heading2"/>
       </w:pPr>
       <w:r>
-        <w:t>11 Kiểm tra bảo mật và tích hợp</w:t>
+        <w:t>10 Kiểm tra bảo mật và tích hợp</w:t>
       </w:r>
     </w:p>
     <w:p>
@@ -2947,20 +2654,19 @@
       <w:r>
         <w:rPr>
           <w:rFonts w:ascii="Arial" w:hAnsi="Arial" w:eastAsia="Arial" w:cs="Arial"/>
-          <w:b/>
           <w:color w:val="000000"/>
           <w:sz w:val="22"/>
+          <w:b/>
         </w:rPr>
-        <w:t xml:space="preserve">Công việc: </w:t>
+        <w:t>Công việc:</w:t>
       </w:r>
       <w:r>
         <w:rPr>
           <w:rFonts w:ascii="Arial" w:hAnsi="Arial" w:eastAsia="Arial" w:cs="Arial"/>
-          <w:b w:val="0"/>
           <w:color w:val="000000"/>
           <w:sz w:val="22"/>
         </w:rPr>
-        <w:t>Rà soát toàn bộ auth, RBAC, MFA admin, RLS/GRANT, IDOR/BOLA, webhook, chống replay, rate limit, CSRF nếu dùng cookie, QR token và secrets. Tests và bảo mật vẫn bắt buộc trong từng giai đoạn trước đó.</w:t>
+        <w:t xml:space="preserve"> R04, R06–R11, R14. Kiểm tra ownership/private minh chứng, mã duy nhất, lưu Hoàn tất/retry và quyền vote đúng số vé; dùng Auth/stack chung. Không thêm phân hệ nghiệp vụ ngoài bổ sung.</w:t>
       </w:r>
     </w:p>
     <w:p>
@@ -2970,20 +2676,19 @@
       <w:r>
         <w:rPr>
           <w:rFonts w:ascii="Arial" w:hAnsi="Arial" w:eastAsia="Arial" w:cs="Arial"/>
-          <w:b/>
           <w:color w:val="000000"/>
           <w:sz w:val="22"/>
+          <w:b/>
         </w:rPr>
-        <w:t xml:space="preserve">Kiểm tra và giới hạn: </w:t>
+        <w:t>Kiểm tra và giới hạn:</w:t>
       </w:r>
       <w:r>
         <w:rPr>
           <w:rFonts w:ascii="Arial" w:hAnsi="Arial" w:eastAsia="Arial" w:cs="Arial"/>
-          <w:b w:val="0"/>
           <w:color w:val="000000"/>
           <w:sz w:val="22"/>
         </w:rPr>
-        <w:t>Chạy unit, integration, E2E và concurrency cho luồng hoàn chỉnh; lint, typecheck, build và CI. Kiểm thử input không hợp lệ, sửa tiền, sai chủ đơn/vé, đổi phiếu và điều kiện hoàn tiền. Ghi rõ test hoặc tích hợp chưa kiểm chứng.</w:t>
+        <w:t xml:space="preserve"> Luồng loại/combo → thông tin → QR → ảnh → Hoàn tất → vote; Origin/auth/role/MFA/owner, private upload, JSON/body limits, snapshot/retry/quota. Không có bypass test trong source production; không test payment/email thật.</w:t>
       </w:r>
     </w:p>
     <w:p>
@@ -2993,20 +2698,19 @@
       <w:r>
         <w:rPr>
           <w:rFonts w:ascii="Arial" w:hAnsi="Arial" w:eastAsia="Arial" w:cs="Arial"/>
-          <w:b/>
           <w:color w:val="000000"/>
           <w:sz w:val="22"/>
+          <w:b/>
         </w:rPr>
-        <w:t xml:space="preserve">Điều kiện đánh X: </w:t>
+        <w:t>Điều kiện đánh X:</w:t>
       </w:r>
       <w:r>
         <w:rPr>
           <w:rFonts w:ascii="Arial" w:hAnsi="Arial" w:eastAsia="Arial" w:cs="Arial"/>
-          <w:b w:val="0"/>
           <w:color w:val="000000"/>
           <w:sz w:val="22"/>
         </w:rPr>
-        <w:t>Không còn lỗi nghiêm trọng chặn nghiệm thu; các checks bắt buộc đạt. Có tài liệu API, rủi ro còn lại và biện pháp xử lý; sandbox hoặc mock được phân biệt rõ với tích hợp thật.</w:t>
+        <w:t xml:space="preserve"> Đã đạt local. TypeScript/lint/build/diff/format và Worker dry-run đạt; 133 tests thường, native riêng và 46 E2E desktop/mobile đạt. Có automated WCAG AA, 320 px và lỗi/retry; không báo đã kiểm tra Auth/Images/R2 online hoặc CI remote.</w:t>
       </w:r>
     </w:p>
     <w:p>
@@ -3014,7 +2718,7 @@
         <w:pStyle w:val="Heading2"/>
       </w:pPr>
       <w:r>
-        <w:t>12 Vận hành và bàn giao</w:t>
+        <w:t>11 Vận hành và bàn giao</w:t>
       </w:r>
     </w:p>
     <w:p>
@@ -3024,20 +2728,19 @@
       <w:r>
         <w:rPr>
           <w:rFonts w:ascii="Arial" w:hAnsi="Arial" w:eastAsia="Arial" w:cs="Arial"/>
-          <w:b/>
           <w:color w:val="000000"/>
           <w:sz w:val="22"/>
+          <w:b/>
         </w:rPr>
-        <w:t xml:space="preserve">Công việc: </w:t>
+        <w:t>Công việc:</w:t>
       </w:r>
       <w:r>
         <w:rPr>
           <w:rFonts w:ascii="Arial" w:hAnsi="Arial" w:eastAsia="Arial" w:cs="Arial"/>
-          <w:b w:val="0"/>
           <w:color w:val="000000"/>
           <w:sz w:val="22"/>
         </w:rPr>
-        <w:t>Chuẩn bị cấu hình Cloudflare Workers, secrets theo môi trường, health check, monitoring database, alert webhook/vote và dashboard giám sát. Hoàn thiện hướng dẫn cài đặt, payment provider, backup, restore và rollback.</w:t>
+        <w:t xml:space="preserve"> R07, R10, R11, R13, R14. Hướng dẫn cấu hình QR, lưu dữ liệu/danh sách, lịch và bàn giao cho bên khác gửi mail thủ công. Chỉ bàn giao phần đã xây và kiểm tra.</w:t>
       </w:r>
     </w:p>
     <w:p>
@@ -3047,20 +2750,19 @@
       <w:r>
         <w:rPr>
           <w:rFonts w:ascii="Arial" w:hAnsi="Arial" w:eastAsia="Arial" w:cs="Arial"/>
-          <w:b/>
           <w:color w:val="000000"/>
           <w:sz w:val="22"/>
+          <w:b/>
         </w:rPr>
-        <w:t xml:space="preserve">Kiểm tra và giới hạn: </w:t>
+        <w:t>Kiểm tra và giới hạn:</w:t>
       </w:r>
       <w:r>
         <w:rPr>
           <w:rFonts w:ascii="Arial" w:hAnsi="Arial" w:eastAsia="Arial" w:cs="Arial"/>
-          <w:b w:val="0"/>
           <w:color w:val="000000"/>
           <w:sz w:val="22"/>
         </w:rPr>
-        <w:t>Viết runbook đêm chung kết: xử lý API chậm, đóng phiên khi sự cố, quyền phê duyệt mở lại, đối soát và nhật ký can thiệp. Bàn giao frontend, backend, migrations, tests, benchmark và tài liệu vận hành.</w:t>
+        <w:t xml:space="preserve"> Runbook cấu hình, quota/hết hạn, ảnh sai/tiền muộn, Hoàn tất lỗi/trùng, orphan và vote. Không hủy/thu hồi/xóa phiếu sau Hoàn tất. Timeline 2027; CMS/đăng ký thuộc người thứ nhất; bên khác gửi email thủ công.</w:t>
       </w:r>
     </w:p>
     <w:p>
@@ -3070,20 +2772,1208 @@
       <w:r>
         <w:rPr>
           <w:rFonts w:ascii="Arial" w:hAnsi="Arial" w:eastAsia="Arial" w:cs="Arial"/>
-          <w:b/>
           <w:color w:val="000000"/>
           <w:sz w:val="22"/>
+          <w:b/>
         </w:rPr>
-        <w:t xml:space="preserve">Điều kiện đánh X: </w:t>
+        <w:t>Điều kiện đánh X:</w:t>
       </w:r>
       <w:r>
         <w:rPr>
           <w:rFonts w:ascii="Arial" w:hAnsi="Arial" w:eastAsia="Arial" w:cs="Arial"/>
-          <w:b w:val="0"/>
           <w:color w:val="000000"/>
           <w:sz w:val="22"/>
         </w:rPr>
-        <w:t>Môi trường được phép đã kiểm chứng vận hành và khôi phục; hồ sơ bàn giao đủ. Production chỉ triển khai khi có yêu cầu và phê duyệt riêng; không tự thay phiếu hoặc thời gian phiên.</w:t>
+        <w:t xml:space="preserve"> Đã đạt. Contract/API, quyết định, bằng chứng, hạn chế và runbook được bàn giao. Không cần tự deploy/migration production/gửi email để nghiệm thu local. Cấu hình thật và staging là điều kiện trước vận hành thật, không phải đã thực hiện.</w:t>
+      </w:r>
+    </w:p>
+    <w:p>
+      <w:pPr>
+        <w:pStyle w:val="Heading1"/>
+        <w:pageBreakBefore/>
+        <w:pageBreakBefore/>
+      </w:pPr>
+      <w:r>
+        <w:t>Bổ sung nghiệp vụ và các điểm cần xác nhận</w:t>
+      </w:r>
+    </w:p>
+    <w:p>
+      <w:pPr>
+        <w:pStyle w:val="Heading2"/>
+      </w:pPr>
+      <w:r>
+        <w:t>Các yêu cầu đã xác nhận</w:t>
+      </w:r>
+    </w:p>
+    <w:p>
+      <w:pPr>
+        <w:spacing w:after="100"/>
+      </w:pPr>
+      <w:r>
+        <w:rPr>
+          <w:rFonts w:ascii="Arial" w:hAnsi="Arial" w:eastAsia="Arial" w:cs="Arial"/>
+          <w:color w:val="000000"/>
+          <w:sz w:val="22"/>
+        </w:rPr>
+        <w:t>Không giới hạn tổng số vé bán cho một tài khoản. Khách chọn loại/cụm vé, số vé hoặc số combo; không chọn ghế. Vé trong một combo được BTC bố trí gần nhau theo quy định combo. Hết quota vé sớm thì khóa vé sớm và chuyển sang loại thường đang mở.</w:t>
+      </w:r>
+    </w:p>
+    <w:p>
+      <w:pPr>
+        <w:spacing w:after="100"/>
+      </w:pPr>
+      <w:r>
+        <w:rPr>
+          <w:rFonts w:ascii="Arial" w:hAnsi="Arial" w:eastAsia="Arial" w:cs="Arial"/>
+          <w:color w:val="000000"/>
+          <w:sz w:val="22"/>
+        </w:rPr>
+        <w:t>Người mua nhập tên, trường, khóa/lớp, MSSV, email, SĐT và Facebook → QR chuyển khoản → tải minh chứng → Hoàn tất. Server lưu thành công thì số vé được tính để vote ngay. Gửi vé email thủ công do bên khác làm; không dùng payOS/SePay/webhook hoặc tự gửi email vé.</w:t>
+      </w:r>
+    </w:p>
+    <w:p>
+      <w:pPr>
+        <w:spacing w:after="100"/>
+      </w:pPr>
+      <w:r>
+        <w:rPr>
+          <w:rFonts w:ascii="Arial" w:hAnsi="Arial" w:eastAsia="Arial" w:cs="Arial"/>
+          <w:color w:val="000000"/>
+          <w:sz w:val="22"/>
+        </w:rPr>
+        <w:t>Xác nhận 14/10/2026: Hoàn tất lưu thành công có vote ngay; không check-in/duyệt/email gate. Timeline 2027 giữ ngày/tháng ảnh. Quota 30 phút; không cap mỗi đơn ngoài quota; không hủy/thu hồi sau Hoàn tất. BTC cấu hình, DEMO local; ảnh thống kê minh họa, thiếu Đêm thì bỏ.</w:t>
+      </w:r>
+    </w:p>
+    <w:p>
+      <w:pPr>
+        <w:pStyle w:val="Heading2"/>
+      </w:pPr>
+      <w:r>
+        <w:t>Cấu hình cần có trước mở bán thật</w:t>
+      </w:r>
+    </w:p>
+    <w:p>
+      <w:pPr>
+        <w:spacing w:after="100"/>
+      </w:pPr>
+      <w:r>
+        <w:rPr>
+          <w:rFonts w:ascii="Arial" w:hAnsi="Arial" w:eastAsia="Arial" w:cs="Arial"/>
+          <w:color w:val="000000"/>
+          <w:sz w:val="22"/>
+        </w:rPr>
+        <w:t>BTC cấu hình giá/quota/combo thật và cách bố trí combo gần nhau. Bộ 100k/190k/280k và quota test là giả; không dùng nó làm giá/quota đã được BTC công bố. Ngày chung kết chưa được ảnh cung cấp.</w:t>
+      </w:r>
+    </w:p>
+    <w:p>
+      <w:pPr>
+        <w:spacing w:after="100"/>
+      </w:pPr>
+      <w:r>
+        <w:rPr>
+          <w:rFonts w:ascii="Arial" w:hAnsi="Arial" w:eastAsia="Arial" w:cs="Arial"/>
+          <w:color w:val="000000"/>
+          <w:sz w:val="22"/>
+        </w:rPr>
+        <w:t>LIVE cần QR/hướng dẫn và asset hợp lệ; thiếu cấu hình không giữ vé để thanh toán. Ảnh JPG/PNG tối đa 5 MB/12 MP. Chỉ giữ quota 30 phút; sau Hoàn tất không hủy/thu hồi quyền. Ảnh không tự chứng minh tiền đã nhận.</w:t>
+      </w:r>
+    </w:p>
+    <w:p>
+      <w:pPr>
+        <w:spacing w:after="100"/>
+      </w:pPr>
+      <w:r>
+        <w:rPr>
+          <w:rFonts w:ascii="Arial" w:hAnsi="Arial" w:eastAsia="Arial" w:cs="Arial"/>
+          <w:color w:val="000000"/>
+          <w:sz w:val="22"/>
+        </w:rPr>
+        <w:t>Supabase đã đồng bộ schema theo yêu cầu mới; chưa tạo fixture/đo tải online. Auth chưa có tài khoản; Worker cần MEDIA/IMAGES và cấu hình thật. Cần kiểm thử tích hợp trước mở bán. Không đưa secret vào source/báo cáo.</w:t>
+      </w:r>
+    </w:p>
+    <w:p>
+      <w:pPr>
+        <w:spacing w:after="100"/>
+      </w:pPr>
+      <w:r>
+        <w:rPr>
+          <w:rFonts w:ascii="Arial" w:hAnsi="Arial" w:eastAsia="Arial" w:cs="Arial"/>
+          <w:color w:val="000000"/>
+          <w:sz w:val="22"/>
+        </w:rPr>
+        <w:t>Lịch 2027 giữ các ngày/tháng ảnh. Giờ/múi giờ, quota thật và thời hạn bán sớm do BTC cấu hình; khoảng 100 vé/2 giờ là dự kiến. 26/4 là mở vé sớm chung kết, không suy thành ngày tổ chức. CMS/đăng ký do người thứ nhất phụ trách.</w:t>
+      </w:r>
+    </w:p>
+    <w:p>
+      <w:pPr>
+        <w:pStyle w:val="Heading2"/>
+      </w:pPr>
+      <w:r>
+        <w:t>Timeline năm 2027 theo nội dung bổ sung</w:t>
+      </w:r>
+    </w:p>
+    <w:p>
+      <w:pPr>
+        <w:spacing w:after="100"/>
+      </w:pPr>
+      <w:r>
+        <w:rPr>
+          <w:rFonts w:ascii="Arial" w:hAnsi="Arial" w:eastAsia="Arial" w:cs="Arial"/>
+          <w:color w:val="000000"/>
+          <w:sz w:val="22"/>
+        </w:rPr>
+        <w:t>Lịch giữ đúng ảnh và năm 2027 theo xác nhận mới nhất. Bán kết 25/4; 26/4 mở vé sớm chung kết; ngày/giờ chung kết chưa có trong ảnh. Không sửa bosung.docx để hợp thức hóa phương án kỹ thuật.</w:t>
+      </w:r>
+    </w:p>
+    <w:tbl>
+      <w:tblPr>
+        <w:tblW w:type="auto" w:w="0"/>
+        <w:jc w:val="center"/>
+        <w:tblLayout w:type="fixed"/>
+        <w:tblLook w:firstColumn="1" w:firstRow="1" w:lastColumn="0" w:lastRow="0" w:noHBand="0" w:noVBand="1" w:val="04A0"/>
+      </w:tblPr>
+      <w:tblGrid>
+        <w:gridCol w:w="1800"/>
+        <w:gridCol w:w="5000"/>
+        <w:gridCol w:w="2400"/>
+      </w:tblGrid>
+      <w:tr>
+        <w:trPr>
+          <w:tblHeader/>
+          <w:cantSplit/>
+        </w:trPr>
+        <w:tc>
+          <w:tcPr>
+            <w:tcW w:type="dxa" w:w="1800"/>
+            <w:vAlign w:val="center"/>
+            <w:tcBorders>
+              <w:top w:val="single" w:sz="5" w:color="D9D9D9"/>
+              <w:left w:val="single" w:sz="5" w:color="D9D9D9"/>
+              <w:bottom w:val="single" w:sz="5" w:color="D9D9D9"/>
+              <w:right w:val="single" w:sz="5" w:color="D9D9D9"/>
+            </w:tcBorders>
+            <w:tcMar>
+              <w:top w:w="80" w:type="dxa"/>
+              <w:bottom w:w="80" w:type="dxa"/>
+              <w:left w:w="100" w:type="dxa"/>
+              <w:right w:w="100" w:type="dxa"/>
+            </w:tcMar>
+            <w:shd w:fill="243C55"/>
+          </w:tcPr>
+          <w:p>
+            <w:pPr>
+              <w:spacing w:after="0" w:before="0" w:line="240" w:lineRule="auto"/>
+              <w:jc w:val="left"/>
+            </w:pPr>
+            <w:r>
+              <w:rPr>
+                <w:rFonts w:ascii="Arial" w:hAnsi="Arial" w:eastAsia="Arial" w:cs="Arial"/>
+                <w:color w:val="FFFFFF"/>
+                <w:sz w:val="20"/>
+                <w:b/>
+              </w:rPr>
+              <w:t>Mốc</w:t>
+            </w:r>
+          </w:p>
+        </w:tc>
+        <w:tc>
+          <w:tcPr>
+            <w:tcW w:type="dxa" w:w="5000"/>
+            <w:vAlign w:val="center"/>
+            <w:tcBorders>
+              <w:top w:val="single" w:sz="5" w:color="D9D9D9"/>
+              <w:left w:val="single" w:sz="5" w:color="D9D9D9"/>
+              <w:bottom w:val="single" w:sz="5" w:color="D9D9D9"/>
+              <w:right w:val="single" w:sz="5" w:color="D9D9D9"/>
+            </w:tcBorders>
+            <w:tcMar>
+              <w:top w:w="80" w:type="dxa"/>
+              <w:bottom w:w="80" w:type="dxa"/>
+              <w:left w:w="100" w:type="dxa"/>
+              <w:right w:w="100" w:type="dxa"/>
+            </w:tcMar>
+            <w:shd w:fill="243C55"/>
+          </w:tcPr>
+          <w:p>
+            <w:pPr>
+              <w:spacing w:after="0" w:before="0" w:line="240" w:lineRule="auto"/>
+              <w:jc w:val="left"/>
+            </w:pPr>
+            <w:r>
+              <w:rPr>
+                <w:rFonts w:ascii="Arial" w:hAnsi="Arial" w:eastAsia="Arial" w:cs="Arial"/>
+                <w:color w:val="FFFFFF"/>
+                <w:sz w:val="20"/>
+                <w:b/>
+              </w:rPr>
+              <w:t>Nội dung</w:t>
+            </w:r>
+          </w:p>
+        </w:tc>
+        <w:tc>
+          <w:tcPr>
+            <w:tcW w:type="dxa" w:w="2400"/>
+            <w:vAlign w:val="center"/>
+            <w:tcBorders>
+              <w:top w:val="single" w:sz="5" w:color="D9D9D9"/>
+              <w:left w:val="single" w:sz="5" w:color="D9D9D9"/>
+              <w:bottom w:val="single" w:sz="5" w:color="D9D9D9"/>
+              <w:right w:val="single" w:sz="5" w:color="D9D9D9"/>
+            </w:tcBorders>
+            <w:tcMar>
+              <w:top w:w="80" w:type="dxa"/>
+              <w:bottom w:w="80" w:type="dxa"/>
+              <w:left w:w="100" w:type="dxa"/>
+              <w:right w:w="100" w:type="dxa"/>
+            </w:tcMar>
+            <w:shd w:fill="243C55"/>
+          </w:tcPr>
+          <w:p>
+            <w:pPr>
+              <w:spacing w:after="0" w:before="0" w:line="240" w:lineRule="auto"/>
+              <w:jc w:val="left"/>
+            </w:pPr>
+            <w:r>
+              <w:rPr>
+                <w:rFonts w:ascii="Arial" w:hAnsi="Arial" w:eastAsia="Arial" w:cs="Arial"/>
+                <w:color w:val="FFFFFF"/>
+                <w:sz w:val="20"/>
+                <w:b/>
+              </w:rPr>
+              <w:t>Phạm vi</w:t>
+            </w:r>
+          </w:p>
+        </w:tc>
+      </w:tr>
+      <w:tr>
+        <w:trPr>
+          <w:cantSplit/>
+        </w:trPr>
+        <w:tc>
+          <w:tcPr>
+            <w:tcW w:type="dxa" w:w="1800"/>
+            <w:vAlign w:val="center"/>
+            <w:tcBorders>
+              <w:top w:val="single" w:sz="5" w:color="D9D9D9"/>
+              <w:left w:val="single" w:sz="5" w:color="D9D9D9"/>
+              <w:bottom w:val="single" w:sz="5" w:color="D9D9D9"/>
+              <w:right w:val="single" w:sz="5" w:color="D9D9D9"/>
+            </w:tcBorders>
+            <w:tcMar>
+              <w:top w:w="80" w:type="dxa"/>
+              <w:bottom w:w="80" w:type="dxa"/>
+              <w:left w:w="100" w:type="dxa"/>
+              <w:right w:w="100" w:type="dxa"/>
+            </w:tcMar>
+            <w:shd w:fill="F2F6FA"/>
+          </w:tcPr>
+          <w:p>
+            <w:pPr>
+              <w:spacing w:after="100"/>
+            </w:pPr>
+            <w:r>
+              <w:rPr>
+                <w:rFonts w:ascii="Arial" w:hAnsi="Arial" w:eastAsia="Arial" w:cs="Arial"/>
+                <w:color w:val="000000"/>
+                <w:sz w:val="22"/>
+              </w:rPr>
+              <w:t>15/2–6/3/2027</w:t>
+            </w:r>
+          </w:p>
+        </w:tc>
+        <w:tc>
+          <w:tcPr>
+            <w:tcW w:type="dxa" w:w="5000"/>
+            <w:vAlign w:val="center"/>
+            <w:tcBorders>
+              <w:top w:val="single" w:sz="5" w:color="D9D9D9"/>
+              <w:left w:val="single" w:sz="5" w:color="D9D9D9"/>
+              <w:bottom w:val="single" w:sz="5" w:color="D9D9D9"/>
+              <w:right w:val="single" w:sz="5" w:color="D9D9D9"/>
+            </w:tcBorders>
+            <w:tcMar>
+              <w:top w:w="80" w:type="dxa"/>
+              <w:bottom w:w="80" w:type="dxa"/>
+              <w:left w:w="100" w:type="dxa"/>
+              <w:right w:w="100" w:type="dxa"/>
+            </w:tcMar>
+            <w:shd w:fill="F2F6FA"/>
+          </w:tcPr>
+          <w:p>
+            <w:pPr>
+              <w:spacing w:after="100"/>
+            </w:pPr>
+            <w:r>
+              <w:rPr>
+                <w:rFonts w:ascii="Arial" w:hAnsi="Arial" w:eastAsia="Arial" w:cs="Arial"/>
+                <w:color w:val="000000"/>
+                <w:sz w:val="22"/>
+              </w:rPr>
+              <w:t>Người dùng chỉ xem nội dung.</w:t>
+            </w:r>
+          </w:p>
+        </w:tc>
+        <w:tc>
+          <w:tcPr>
+            <w:tcW w:type="dxa" w:w="2400"/>
+            <w:vAlign w:val="center"/>
+            <w:tcBorders>
+              <w:top w:val="single" w:sz="5" w:color="D9D9D9"/>
+              <w:left w:val="single" w:sz="5" w:color="D9D9D9"/>
+              <w:bottom w:val="single" w:sz="5" w:color="D9D9D9"/>
+              <w:right w:val="single" w:sz="5" w:color="D9D9D9"/>
+            </w:tcBorders>
+            <w:tcMar>
+              <w:top w:w="80" w:type="dxa"/>
+              <w:bottom w:w="80" w:type="dxa"/>
+              <w:left w:w="100" w:type="dxa"/>
+              <w:right w:w="100" w:type="dxa"/>
+            </w:tcMar>
+            <w:shd w:fill="F2F6FA"/>
+          </w:tcPr>
+          <w:p>
+            <w:pPr>
+              <w:spacing w:after="100"/>
+            </w:pPr>
+            <w:r>
+              <w:rPr>
+                <w:rFonts w:ascii="Arial" w:hAnsi="Arial" w:eastAsia="Arial" w:cs="Arial"/>
+                <w:color w:val="000000"/>
+                <w:sz w:val="22"/>
+              </w:rPr>
+              <w:t>CMS và frontend chung</w:t>
+            </w:r>
+          </w:p>
+        </w:tc>
+      </w:tr>
+      <w:tr>
+        <w:trPr>
+          <w:cantSplit/>
+        </w:trPr>
+        <w:tc>
+          <w:tcPr>
+            <w:tcW w:type="dxa" w:w="1800"/>
+            <w:vAlign w:val="center"/>
+            <w:tcBorders>
+              <w:top w:val="single" w:sz="5" w:color="D9D9D9"/>
+              <w:left w:val="single" w:sz="5" w:color="D9D9D9"/>
+              <w:bottom w:val="single" w:sz="5" w:color="D9D9D9"/>
+              <w:right w:val="single" w:sz="5" w:color="D9D9D9"/>
+            </w:tcBorders>
+            <w:tcMar>
+              <w:top w:w="80" w:type="dxa"/>
+              <w:bottom w:w="80" w:type="dxa"/>
+              <w:left w:w="100" w:type="dxa"/>
+              <w:right w:w="100" w:type="dxa"/>
+            </w:tcMar>
+            <w:shd w:fill="F2F6FA"/>
+          </w:tcPr>
+          <w:p>
+            <w:pPr>
+              <w:spacing w:after="100"/>
+            </w:pPr>
+            <w:r>
+              <w:rPr>
+                <w:rFonts w:ascii="Arial" w:hAnsi="Arial" w:eastAsia="Arial" w:cs="Arial"/>
+                <w:color w:val="000000"/>
+                <w:sz w:val="22"/>
+              </w:rPr>
+              <w:t>7/3/2027</w:t>
+            </w:r>
+          </w:p>
+        </w:tc>
+        <w:tc>
+          <w:tcPr>
+            <w:tcW w:type="dxa" w:w="5000"/>
+            <w:vAlign w:val="center"/>
+            <w:tcBorders>
+              <w:top w:val="single" w:sz="5" w:color="D9D9D9"/>
+              <w:left w:val="single" w:sz="5" w:color="D9D9D9"/>
+              <w:bottom w:val="single" w:sz="5" w:color="D9D9D9"/>
+              <w:right w:val="single" w:sz="5" w:color="D9D9D9"/>
+            </w:tcBorders>
+            <w:tcMar>
+              <w:top w:w="80" w:type="dxa"/>
+              <w:bottom w:w="80" w:type="dxa"/>
+              <w:left w:w="100" w:type="dxa"/>
+              <w:right w:w="100" w:type="dxa"/>
+            </w:tcMar>
+            <w:shd w:fill="F2F6FA"/>
+          </w:tcPr>
+          <w:p>
+            <w:pPr>
+              <w:spacing w:after="100"/>
+            </w:pPr>
+            <w:r>
+              <w:rPr>
+                <w:rFonts w:ascii="Arial" w:hAnsi="Arial" w:eastAsia="Arial" w:cs="Arial"/>
+                <w:color w:val="000000"/>
+                <w:sz w:val="22"/>
+              </w:rPr>
+              <w:t>Mở đơn đăng ký thí sinh.</w:t>
+            </w:r>
+          </w:p>
+        </w:tc>
+        <w:tc>
+          <w:tcPr>
+            <w:tcW w:type="dxa" w:w="2400"/>
+            <w:vAlign w:val="center"/>
+            <w:tcBorders>
+              <w:top w:val="single" w:sz="5" w:color="D9D9D9"/>
+              <w:left w:val="single" w:sz="5" w:color="D9D9D9"/>
+              <w:bottom w:val="single" w:sz="5" w:color="D9D9D9"/>
+              <w:right w:val="single" w:sz="5" w:color="D9D9D9"/>
+            </w:tcBorders>
+            <w:tcMar>
+              <w:top w:w="80" w:type="dxa"/>
+              <w:bottom w:w="80" w:type="dxa"/>
+              <w:left w:w="100" w:type="dxa"/>
+              <w:right w:w="100" w:type="dxa"/>
+            </w:tcMar>
+            <w:shd w:fill="F2F6FA"/>
+          </w:tcPr>
+          <w:p>
+            <w:pPr>
+              <w:spacing w:after="100"/>
+            </w:pPr>
+            <w:r>
+              <w:rPr>
+                <w:rFonts w:ascii="Arial" w:hAnsi="Arial" w:eastAsia="Arial" w:cs="Arial"/>
+                <w:color w:val="000000"/>
+                <w:sz w:val="22"/>
+              </w:rPr>
+              <w:t>Phối hợp người thứ nhất</w:t>
+            </w:r>
+          </w:p>
+        </w:tc>
+      </w:tr>
+      <w:tr>
+        <w:trPr>
+          <w:cantSplit/>
+        </w:trPr>
+        <w:tc>
+          <w:tcPr>
+            <w:tcW w:type="dxa" w:w="1800"/>
+            <w:vAlign w:val="center"/>
+            <w:tcBorders>
+              <w:top w:val="single" w:sz="5" w:color="D9D9D9"/>
+              <w:left w:val="single" w:sz="5" w:color="D9D9D9"/>
+              <w:bottom w:val="single" w:sz="5" w:color="D9D9D9"/>
+              <w:right w:val="single" w:sz="5" w:color="D9D9D9"/>
+            </w:tcBorders>
+            <w:tcMar>
+              <w:top w:w="80" w:type="dxa"/>
+              <w:bottom w:w="80" w:type="dxa"/>
+              <w:left w:w="100" w:type="dxa"/>
+              <w:right w:w="100" w:type="dxa"/>
+            </w:tcMar>
+            <w:shd w:fill="F2F6FA"/>
+          </w:tcPr>
+          <w:p>
+            <w:pPr>
+              <w:spacing w:after="100"/>
+            </w:pPr>
+            <w:r>
+              <w:rPr>
+                <w:rFonts w:ascii="Arial" w:hAnsi="Arial" w:eastAsia="Arial" w:cs="Arial"/>
+                <w:color w:val="000000"/>
+                <w:sz w:val="22"/>
+              </w:rPr>
+              <w:t>21/3/2027</w:t>
+            </w:r>
+          </w:p>
+        </w:tc>
+        <w:tc>
+          <w:tcPr>
+            <w:tcW w:type="dxa" w:w="5000"/>
+            <w:vAlign w:val="center"/>
+            <w:tcBorders>
+              <w:top w:val="single" w:sz="5" w:color="D9D9D9"/>
+              <w:left w:val="single" w:sz="5" w:color="D9D9D9"/>
+              <w:bottom w:val="single" w:sz="5" w:color="D9D9D9"/>
+              <w:right w:val="single" w:sz="5" w:color="D9D9D9"/>
+            </w:tcBorders>
+            <w:tcMar>
+              <w:top w:w="80" w:type="dxa"/>
+              <w:bottom w:w="80" w:type="dxa"/>
+              <w:left w:w="100" w:type="dxa"/>
+              <w:right w:w="100" w:type="dxa"/>
+            </w:tcMar>
+            <w:shd w:fill="F2F6FA"/>
+          </w:tcPr>
+          <w:p>
+            <w:pPr>
+              <w:spacing w:after="100"/>
+            </w:pPr>
+            <w:r>
+              <w:rPr>
+                <w:rFonts w:ascii="Arial" w:hAnsi="Arial" w:eastAsia="Arial" w:cs="Arial"/>
+                <w:color w:val="000000"/>
+                <w:sz w:val="22"/>
+              </w:rPr>
+              <w:t>Đóng đơn đăng ký thí sinh.</w:t>
+            </w:r>
+          </w:p>
+        </w:tc>
+        <w:tc>
+          <w:tcPr>
+            <w:tcW w:type="dxa" w:w="2400"/>
+            <w:vAlign w:val="center"/>
+            <w:tcBorders>
+              <w:top w:val="single" w:sz="5" w:color="D9D9D9"/>
+              <w:left w:val="single" w:sz="5" w:color="D9D9D9"/>
+              <w:bottom w:val="single" w:sz="5" w:color="D9D9D9"/>
+              <w:right w:val="single" w:sz="5" w:color="D9D9D9"/>
+            </w:tcBorders>
+            <w:tcMar>
+              <w:top w:w="80" w:type="dxa"/>
+              <w:bottom w:w="80" w:type="dxa"/>
+              <w:left w:w="100" w:type="dxa"/>
+              <w:right w:w="100" w:type="dxa"/>
+            </w:tcMar>
+            <w:shd w:fill="F2F6FA"/>
+          </w:tcPr>
+          <w:p>
+            <w:pPr>
+              <w:spacing w:after="100"/>
+            </w:pPr>
+            <w:r>
+              <w:rPr>
+                <w:rFonts w:ascii="Arial" w:hAnsi="Arial" w:eastAsia="Arial" w:cs="Arial"/>
+                <w:color w:val="000000"/>
+                <w:sz w:val="22"/>
+              </w:rPr>
+              <w:t>Phối hợp người thứ nhất</w:t>
+            </w:r>
+          </w:p>
+        </w:tc>
+      </w:tr>
+      <w:tr>
+        <w:trPr>
+          <w:cantSplit/>
+        </w:trPr>
+        <w:tc>
+          <w:tcPr>
+            <w:tcW w:type="dxa" w:w="1800"/>
+            <w:vAlign w:val="center"/>
+            <w:tcBorders>
+              <w:top w:val="single" w:sz="5" w:color="D9D9D9"/>
+              <w:left w:val="single" w:sz="5" w:color="D9D9D9"/>
+              <w:bottom w:val="single" w:sz="5" w:color="D9D9D9"/>
+              <w:right w:val="single" w:sz="5" w:color="D9D9D9"/>
+            </w:tcBorders>
+            <w:tcMar>
+              <w:top w:w="80" w:type="dxa"/>
+              <w:bottom w:w="80" w:type="dxa"/>
+              <w:left w:w="100" w:type="dxa"/>
+              <w:right w:w="100" w:type="dxa"/>
+            </w:tcMar>
+            <w:shd w:fill="F2F6FA"/>
+          </w:tcPr>
+          <w:p>
+            <w:pPr>
+              <w:spacing w:after="100"/>
+            </w:pPr>
+            <w:r>
+              <w:rPr>
+                <w:rFonts w:ascii="Arial" w:hAnsi="Arial" w:eastAsia="Arial" w:cs="Arial"/>
+                <w:color w:val="000000"/>
+                <w:sz w:val="22"/>
+              </w:rPr>
+              <w:t>29/3/2027</w:t>
+            </w:r>
+          </w:p>
+        </w:tc>
+        <w:tc>
+          <w:tcPr>
+            <w:tcW w:type="dxa" w:w="5000"/>
+            <w:vAlign w:val="center"/>
+            <w:tcBorders>
+              <w:top w:val="single" w:sz="5" w:color="D9D9D9"/>
+              <w:left w:val="single" w:sz="5" w:color="D9D9D9"/>
+              <w:bottom w:val="single" w:sz="5" w:color="D9D9D9"/>
+              <w:right w:val="single" w:sz="5" w:color="D9D9D9"/>
+            </w:tcBorders>
+            <w:tcMar>
+              <w:top w:w="80" w:type="dxa"/>
+              <w:bottom w:w="80" w:type="dxa"/>
+              <w:left w:w="100" w:type="dxa"/>
+              <w:right w:w="100" w:type="dxa"/>
+            </w:tcMar>
+            <w:shd w:fill="F2F6FA"/>
+          </w:tcPr>
+          <w:p>
+            <w:pPr>
+              <w:spacing w:after="100"/>
+            </w:pPr>
+            <w:r>
+              <w:rPr>
+                <w:rFonts w:ascii="Arial" w:hAnsi="Arial" w:eastAsia="Arial" w:cs="Arial"/>
+                <w:color w:val="000000"/>
+                <w:sz w:val="22"/>
+              </w:rPr>
+              <w:t>Mở bán sớm 2 ngày; khoảng 100 vé, dự kiến hết trong khoảng 2 giờ. Hết quota thì khóa vé sớm.</w:t>
+            </w:r>
+          </w:p>
+        </w:tc>
+        <w:tc>
+          <w:tcPr>
+            <w:tcW w:type="dxa" w:w="2400"/>
+            <w:vAlign w:val="center"/>
+            <w:tcBorders>
+              <w:top w:val="single" w:sz="5" w:color="D9D9D9"/>
+              <w:left w:val="single" w:sz="5" w:color="D9D9D9"/>
+              <w:bottom w:val="single" w:sz="5" w:color="D9D9D9"/>
+              <w:right w:val="single" w:sz="5" w:color="D9D9D9"/>
+            </w:tcBorders>
+            <w:tcMar>
+              <w:top w:w="80" w:type="dxa"/>
+              <w:bottom w:w="80" w:type="dxa"/>
+              <w:left w:w="100" w:type="dxa"/>
+              <w:right w:w="100" w:type="dxa"/>
+            </w:tcMar>
+            <w:shd w:fill="F2F6FA"/>
+          </w:tcPr>
+          <w:p>
+            <w:pPr>
+              <w:spacing w:after="100"/>
+            </w:pPr>
+            <w:r>
+              <w:rPr>
+                <w:rFonts w:ascii="Arial" w:hAnsi="Arial" w:eastAsia="Arial" w:cs="Arial"/>
+                <w:color w:val="000000"/>
+                <w:sz w:val="22"/>
+              </w:rPr>
+              <w:t>Bán vé; quota và giờ cần chốt</w:t>
+            </w:r>
+          </w:p>
+        </w:tc>
+      </w:tr>
+      <w:tr>
+        <w:trPr>
+          <w:cantSplit/>
+        </w:trPr>
+        <w:tc>
+          <w:tcPr>
+            <w:tcW w:type="dxa" w:w="1800"/>
+            <w:vAlign w:val="center"/>
+            <w:tcBorders>
+              <w:top w:val="single" w:sz="5" w:color="D9D9D9"/>
+              <w:left w:val="single" w:sz="5" w:color="D9D9D9"/>
+              <w:bottom w:val="single" w:sz="5" w:color="D9D9D9"/>
+              <w:right w:val="single" w:sz="5" w:color="D9D9D9"/>
+            </w:tcBorders>
+            <w:tcMar>
+              <w:top w:w="80" w:type="dxa"/>
+              <w:bottom w:w="80" w:type="dxa"/>
+              <w:left w:w="100" w:type="dxa"/>
+              <w:right w:w="100" w:type="dxa"/>
+            </w:tcMar>
+            <w:shd w:fill="F2F6FA"/>
+          </w:tcPr>
+          <w:p>
+            <w:pPr>
+              <w:spacing w:after="100"/>
+            </w:pPr>
+            <w:r>
+              <w:rPr>
+                <w:rFonts w:ascii="Arial" w:hAnsi="Arial" w:eastAsia="Arial" w:cs="Arial"/>
+                <w:color w:val="000000"/>
+                <w:sz w:val="22"/>
+              </w:rPr>
+              <w:t>Sau đợt vé sớm</w:t>
+            </w:r>
+          </w:p>
+        </w:tc>
+        <w:tc>
+          <w:tcPr>
+            <w:tcW w:type="dxa" w:w="5000"/>
+            <w:vAlign w:val="center"/>
+            <w:tcBorders>
+              <w:top w:val="single" w:sz="5" w:color="D9D9D9"/>
+              <w:left w:val="single" w:sz="5" w:color="D9D9D9"/>
+              <w:bottom w:val="single" w:sz="5" w:color="D9D9D9"/>
+              <w:right w:val="single" w:sz="5" w:color="D9D9D9"/>
+            </w:tcBorders>
+            <w:tcMar>
+              <w:top w:w="80" w:type="dxa"/>
+              <w:bottom w:w="80" w:type="dxa"/>
+              <w:left w:w="100" w:type="dxa"/>
+              <w:right w:w="100" w:type="dxa"/>
+            </w:tcMar>
+            <w:shd w:fill="F2F6FA"/>
+          </w:tcPr>
+          <w:p>
+            <w:pPr>
+              <w:spacing w:after="100"/>
+            </w:pPr>
+            <w:r>
+              <w:rPr>
+                <w:rFonts w:ascii="Arial" w:hAnsi="Arial" w:eastAsia="Arial" w:cs="Arial"/>
+                <w:color w:val="000000"/>
+                <w:sz w:val="22"/>
+              </w:rPr>
+              <w:t>Cập nhật giá và mở bán vé thường.</w:t>
+            </w:r>
+          </w:p>
+        </w:tc>
+        <w:tc>
+          <w:tcPr>
+            <w:tcW w:type="dxa" w:w="2400"/>
+            <w:vAlign w:val="center"/>
+            <w:tcBorders>
+              <w:top w:val="single" w:sz="5" w:color="D9D9D9"/>
+              <w:left w:val="single" w:sz="5" w:color="D9D9D9"/>
+              <w:bottom w:val="single" w:sz="5" w:color="D9D9D9"/>
+              <w:right w:val="single" w:sz="5" w:color="D9D9D9"/>
+            </w:tcBorders>
+            <w:tcMar>
+              <w:top w:w="80" w:type="dxa"/>
+              <w:bottom w:w="80" w:type="dxa"/>
+              <w:left w:w="100" w:type="dxa"/>
+              <w:right w:w="100" w:type="dxa"/>
+            </w:tcMar>
+            <w:shd w:fill="F2F6FA"/>
+          </w:tcPr>
+          <w:p>
+            <w:pPr>
+              <w:spacing w:after="100"/>
+            </w:pPr>
+            <w:r>
+              <w:rPr>
+                <w:rFonts w:ascii="Arial" w:hAnsi="Arial" w:eastAsia="Arial" w:cs="Arial"/>
+                <w:color w:val="000000"/>
+                <w:sz w:val="22"/>
+              </w:rPr>
+              <w:t>Bán vé; ngày chuyển cần chốt</w:t>
+            </w:r>
+          </w:p>
+        </w:tc>
+      </w:tr>
+      <w:tr>
+        <w:trPr>
+          <w:cantSplit/>
+        </w:trPr>
+        <w:tc>
+          <w:tcPr>
+            <w:tcW w:type="dxa" w:w="1800"/>
+            <w:vAlign w:val="center"/>
+            <w:tcBorders>
+              <w:top w:val="single" w:sz="5" w:color="D9D9D9"/>
+              <w:left w:val="single" w:sz="5" w:color="D9D9D9"/>
+              <w:bottom w:val="single" w:sz="5" w:color="D9D9D9"/>
+              <w:right w:val="single" w:sz="5" w:color="D9D9D9"/>
+            </w:tcBorders>
+            <w:tcMar>
+              <w:top w:w="80" w:type="dxa"/>
+              <w:bottom w:w="80" w:type="dxa"/>
+              <w:left w:w="100" w:type="dxa"/>
+              <w:right w:w="100" w:type="dxa"/>
+            </w:tcMar>
+            <w:shd w:fill="F2F6FA"/>
+          </w:tcPr>
+          <w:p>
+            <w:pPr>
+              <w:spacing w:after="100"/>
+            </w:pPr>
+            <w:r>
+              <w:rPr>
+                <w:rFonts w:ascii="Arial" w:hAnsi="Arial" w:eastAsia="Arial" w:cs="Arial"/>
+                <w:color w:val="000000"/>
+                <w:sz w:val="22"/>
+              </w:rPr>
+              <w:t>Đến 24/4/2027</w:t>
+            </w:r>
+          </w:p>
+        </w:tc>
+        <w:tc>
+          <w:tcPr>
+            <w:tcW w:type="dxa" w:w="5000"/>
+            <w:vAlign w:val="center"/>
+            <w:tcBorders>
+              <w:top w:val="single" w:sz="5" w:color="D9D9D9"/>
+              <w:left w:val="single" w:sz="5" w:color="D9D9D9"/>
+              <w:bottom w:val="single" w:sz="5" w:color="D9D9D9"/>
+              <w:right w:val="single" w:sz="5" w:color="D9D9D9"/>
+            </w:tcBorders>
+            <w:tcMar>
+              <w:top w:w="80" w:type="dxa"/>
+              <w:bottom w:w="80" w:type="dxa"/>
+              <w:left w:w="100" w:type="dxa"/>
+              <w:right w:w="100" w:type="dxa"/>
+            </w:tcMar>
+            <w:shd w:fill="F2F6FA"/>
+          </w:tcPr>
+          <w:p>
+            <w:pPr>
+              <w:spacing w:after="100"/>
+            </w:pPr>
+            <w:r>
+              <w:rPr>
+                <w:rFonts w:ascii="Arial" w:hAnsi="Arial" w:eastAsia="Arial" w:cs="Arial"/>
+                <w:color w:val="000000"/>
+                <w:sz w:val="22"/>
+              </w:rPr>
+              <w:t>Bán vé thường đến mốc này.</w:t>
+            </w:r>
+          </w:p>
+        </w:tc>
+        <w:tc>
+          <w:tcPr>
+            <w:tcW w:type="dxa" w:w="2400"/>
+            <w:vAlign w:val="center"/>
+            <w:tcBorders>
+              <w:top w:val="single" w:sz="5" w:color="D9D9D9"/>
+              <w:left w:val="single" w:sz="5" w:color="D9D9D9"/>
+              <w:bottom w:val="single" w:sz="5" w:color="D9D9D9"/>
+              <w:right w:val="single" w:sz="5" w:color="D9D9D9"/>
+            </w:tcBorders>
+            <w:tcMar>
+              <w:top w:w="80" w:type="dxa"/>
+              <w:bottom w:w="80" w:type="dxa"/>
+              <w:left w:w="100" w:type="dxa"/>
+              <w:right w:w="100" w:type="dxa"/>
+            </w:tcMar>
+            <w:shd w:fill="F2F6FA"/>
+          </w:tcPr>
+          <w:p>
+            <w:pPr>
+              <w:spacing w:after="100"/>
+            </w:pPr>
+            <w:r>
+              <w:rPr>
+                <w:rFonts w:ascii="Arial" w:hAnsi="Arial" w:eastAsia="Arial" w:cs="Arial"/>
+                <w:color w:val="000000"/>
+                <w:sz w:val="22"/>
+              </w:rPr>
+              <w:t>Bán vé; giờ đóng cần chốt</w:t>
+            </w:r>
+          </w:p>
+        </w:tc>
+      </w:tr>
+      <w:tr>
+        <w:trPr>
+          <w:cantSplit/>
+        </w:trPr>
+        <w:tc>
+          <w:tcPr>
+            <w:tcW w:type="dxa" w:w="1800"/>
+            <w:vAlign w:val="center"/>
+            <w:tcBorders>
+              <w:top w:val="single" w:sz="5" w:color="D9D9D9"/>
+              <w:left w:val="single" w:sz="5" w:color="D9D9D9"/>
+              <w:bottom w:val="single" w:sz="5" w:color="D9D9D9"/>
+              <w:right w:val="single" w:sz="5" w:color="D9D9D9"/>
+            </w:tcBorders>
+            <w:tcMar>
+              <w:top w:w="80" w:type="dxa"/>
+              <w:bottom w:w="80" w:type="dxa"/>
+              <w:left w:w="100" w:type="dxa"/>
+              <w:right w:w="100" w:type="dxa"/>
+            </w:tcMar>
+            <w:shd w:fill="F2F6FA"/>
+          </w:tcPr>
+          <w:p>
+            <w:pPr>
+              <w:spacing w:after="100"/>
+            </w:pPr>
+            <w:r>
+              <w:rPr>
+                <w:rFonts w:ascii="Arial" w:hAnsi="Arial" w:eastAsia="Arial" w:cs="Arial"/>
+                <w:color w:val="000000"/>
+                <w:sz w:val="22"/>
+              </w:rPr>
+              <w:t>25/4/2027</w:t>
+            </w:r>
+          </w:p>
+        </w:tc>
+        <w:tc>
+          <w:tcPr>
+            <w:tcW w:type="dxa" w:w="5000"/>
+            <w:vAlign w:val="center"/>
+            <w:tcBorders>
+              <w:top w:val="single" w:sz="5" w:color="D9D9D9"/>
+              <w:left w:val="single" w:sz="5" w:color="D9D9D9"/>
+              <w:bottom w:val="single" w:sz="5" w:color="D9D9D9"/>
+              <w:right w:val="single" w:sz="5" w:color="D9D9D9"/>
+            </w:tcBorders>
+            <w:tcMar>
+              <w:top w:w="80" w:type="dxa"/>
+              <w:bottom w:w="80" w:type="dxa"/>
+              <w:left w:w="100" w:type="dxa"/>
+              <w:right w:w="100" w:type="dxa"/>
+            </w:tcMar>
+            <w:shd w:fill="F2F6FA"/>
+          </w:tcPr>
+          <w:p>
+            <w:pPr>
+              <w:spacing w:after="100"/>
+            </w:pPr>
+            <w:r>
+              <w:rPr>
+                <w:rFonts w:ascii="Arial" w:hAnsi="Arial" w:eastAsia="Arial" w:cs="Arial"/>
+                <w:color w:val="000000"/>
+                <w:sz w:val="22"/>
+              </w:rPr>
+              <w:t>Bán kết; mở và đóng vote trong ngày, cửa sổ 10 phút.</w:t>
+            </w:r>
+          </w:p>
+        </w:tc>
+        <w:tc>
+          <w:tcPr>
+            <w:tcW w:type="dxa" w:w="2400"/>
+            <w:vAlign w:val="center"/>
+            <w:tcBorders>
+              <w:top w:val="single" w:sz="5" w:color="D9D9D9"/>
+              <w:left w:val="single" w:sz="5" w:color="D9D9D9"/>
+              <w:bottom w:val="single" w:sz="5" w:color="D9D9D9"/>
+              <w:right w:val="single" w:sz="5" w:color="D9D9D9"/>
+            </w:tcBorders>
+            <w:tcMar>
+              <w:top w:w="80" w:type="dxa"/>
+              <w:bottom w:w="80" w:type="dxa"/>
+              <w:left w:w="100" w:type="dxa"/>
+              <w:right w:w="100" w:type="dxa"/>
+            </w:tcMar>
+            <w:shd w:fill="F2F6FA"/>
+          </w:tcPr>
+          <w:p>
+            <w:pPr>
+              <w:spacing w:after="100"/>
+            </w:pPr>
+            <w:r>
+              <w:rPr>
+                <w:rFonts w:ascii="Arial" w:hAnsi="Arial" w:eastAsia="Arial" w:cs="Arial"/>
+                <w:color w:val="000000"/>
+                <w:sz w:val="22"/>
+              </w:rPr>
+              <w:t>Vote; giờ cụ thể cần chốt</w:t>
+            </w:r>
+          </w:p>
+        </w:tc>
+      </w:tr>
+      <w:tr>
+        <w:trPr>
+          <w:cantSplit/>
+        </w:trPr>
+        <w:tc>
+          <w:tcPr>
+            <w:tcW w:type="dxa" w:w="1800"/>
+            <w:vAlign w:val="center"/>
+            <w:tcBorders>
+              <w:top w:val="single" w:sz="5" w:color="D9D9D9"/>
+              <w:left w:val="single" w:sz="5" w:color="D9D9D9"/>
+              <w:bottom w:val="single" w:sz="5" w:color="D9D9D9"/>
+              <w:right w:val="single" w:sz="5" w:color="D9D9D9"/>
+            </w:tcBorders>
+            <w:tcMar>
+              <w:top w:w="80" w:type="dxa"/>
+              <w:bottom w:w="80" w:type="dxa"/>
+              <w:left w:w="100" w:type="dxa"/>
+              <w:right w:w="100" w:type="dxa"/>
+            </w:tcMar>
+            <w:shd w:fill="F2F6FA"/>
+          </w:tcPr>
+          <w:p>
+            <w:pPr>
+              <w:spacing w:after="100"/>
+            </w:pPr>
+            <w:r>
+              <w:rPr>
+                <w:rFonts w:ascii="Arial" w:hAnsi="Arial" w:eastAsia="Arial" w:cs="Arial"/>
+                <w:color w:val="000000"/>
+                <w:sz w:val="22"/>
+              </w:rPr>
+              <w:t>26/4/2027</w:t>
+            </w:r>
+          </w:p>
+        </w:tc>
+        <w:tc>
+          <w:tcPr>
+            <w:tcW w:type="dxa" w:w="5000"/>
+            <w:vAlign w:val="center"/>
+            <w:tcBorders>
+              <w:top w:val="single" w:sz="5" w:color="D9D9D9"/>
+              <w:left w:val="single" w:sz="5" w:color="D9D9D9"/>
+              <w:bottom w:val="single" w:sz="5" w:color="D9D9D9"/>
+              <w:right w:val="single" w:sz="5" w:color="D9D9D9"/>
+            </w:tcBorders>
+            <w:tcMar>
+              <w:top w:w="80" w:type="dxa"/>
+              <w:bottom w:w="80" w:type="dxa"/>
+              <w:left w:w="100" w:type="dxa"/>
+              <w:right w:w="100" w:type="dxa"/>
+            </w:tcMar>
+            <w:shd w:fill="F2F6FA"/>
+          </w:tcPr>
+          <w:p>
+            <w:pPr>
+              <w:spacing w:after="100"/>
+            </w:pPr>
+            <w:r>
+              <w:rPr>
+                <w:rFonts w:ascii="Arial" w:hAnsi="Arial" w:eastAsia="Arial" w:cs="Arial"/>
+                <w:color w:val="000000"/>
+                <w:sz w:val="22"/>
+              </w:rPr>
+              <w:t>Mở vé sớm chung kết khoảng 2 giờ, số vé theo quy định BTC.</w:t>
+            </w:r>
+          </w:p>
+        </w:tc>
+        <w:tc>
+          <w:tcPr>
+            <w:tcW w:type="dxa" w:w="2400"/>
+            <w:vAlign w:val="center"/>
+            <w:tcBorders>
+              <w:top w:val="single" w:sz="5" w:color="D9D9D9"/>
+              <w:left w:val="single" w:sz="5" w:color="D9D9D9"/>
+              <w:bottom w:val="single" w:sz="5" w:color="D9D9D9"/>
+              <w:right w:val="single" w:sz="5" w:color="D9D9D9"/>
+            </w:tcBorders>
+            <w:tcMar>
+              <w:top w:w="80" w:type="dxa"/>
+              <w:bottom w:w="80" w:type="dxa"/>
+              <w:left w:w="100" w:type="dxa"/>
+              <w:right w:w="100" w:type="dxa"/>
+            </w:tcMar>
+            <w:shd w:fill="F2F6FA"/>
+          </w:tcPr>
+          <w:p>
+            <w:pPr>
+              <w:spacing w:after="100"/>
+            </w:pPr>
+            <w:r>
+              <w:rPr>
+                <w:rFonts w:ascii="Arial" w:hAnsi="Arial" w:eastAsia="Arial" w:cs="Arial"/>
+                <w:color w:val="000000"/>
+                <w:sz w:val="22"/>
+              </w:rPr>
+              <w:t>Bán vé; quota và giờ cần chốt</w:t>
+            </w:r>
+          </w:p>
+        </w:tc>
+      </w:tr>
+      <w:tr>
+        <w:trPr>
+          <w:cantSplit/>
+        </w:trPr>
+        <w:tc>
+          <w:tcPr>
+            <w:tcW w:type="dxa" w:w="1800"/>
+            <w:vAlign w:val="center"/>
+            <w:tcBorders>
+              <w:top w:val="single" w:sz="5" w:color="D9D9D9"/>
+              <w:left w:val="single" w:sz="5" w:color="D9D9D9"/>
+              <w:bottom w:val="single" w:sz="5" w:color="D9D9D9"/>
+              <w:right w:val="single" w:sz="5" w:color="D9D9D9"/>
+            </w:tcBorders>
+            <w:tcMar>
+              <w:top w:w="80" w:type="dxa"/>
+              <w:bottom w:w="80" w:type="dxa"/>
+              <w:left w:w="100" w:type="dxa"/>
+              <w:right w:w="100" w:type="dxa"/>
+            </w:tcMar>
+            <w:shd w:fill="F2F6FA"/>
+          </w:tcPr>
+          <w:p>
+            <w:pPr>
+              <w:spacing w:after="100"/>
+            </w:pPr>
+            <w:r>
+              <w:rPr>
+                <w:rFonts w:ascii="Arial" w:hAnsi="Arial" w:eastAsia="Arial" w:cs="Arial"/>
+                <w:color w:val="000000"/>
+                <w:sz w:val="22"/>
+              </w:rPr>
+              <w:t>10/5–11/5/2027</w:t>
+            </w:r>
+          </w:p>
+        </w:tc>
+        <w:tc>
+          <w:tcPr>
+            <w:tcW w:type="dxa" w:w="5000"/>
+            <w:vAlign w:val="center"/>
+            <w:tcBorders>
+              <w:top w:val="single" w:sz="5" w:color="D9D9D9"/>
+              <w:left w:val="single" w:sz="5" w:color="D9D9D9"/>
+              <w:bottom w:val="single" w:sz="5" w:color="D9D9D9"/>
+              <w:right w:val="single" w:sz="5" w:color="D9D9D9"/>
+            </w:tcBorders>
+            <w:tcMar>
+              <w:top w:w="80" w:type="dxa"/>
+              <w:bottom w:w="80" w:type="dxa"/>
+              <w:left w:w="100" w:type="dxa"/>
+              <w:right w:w="100" w:type="dxa"/>
+            </w:tcMar>
+            <w:shd w:fill="F2F6FA"/>
+          </w:tcPr>
+          <w:p>
+            <w:pPr>
+              <w:spacing w:after="100"/>
+            </w:pPr>
+            <w:r>
+              <w:rPr>
+                <w:rFonts w:ascii="Arial" w:hAnsi="Arial" w:eastAsia="Arial" w:cs="Arial"/>
+                <w:color w:val="000000"/>
+                <w:sz w:val="22"/>
+              </w:rPr>
+              <w:t>Cập nhật ảnh những người vào bán kết theo ảnh timeline.</w:t>
+            </w:r>
+          </w:p>
+        </w:tc>
+        <w:tc>
+          <w:tcPr>
+            <w:tcW w:type="dxa" w:w="2400"/>
+            <w:vAlign w:val="center"/>
+            <w:tcBorders>
+              <w:top w:val="single" w:sz="5" w:color="D9D9D9"/>
+              <w:left w:val="single" w:sz="5" w:color="D9D9D9"/>
+              <w:bottom w:val="single" w:sz="5" w:color="D9D9D9"/>
+              <w:right w:val="single" w:sz="5" w:color="D9D9D9"/>
+            </w:tcBorders>
+            <w:tcMar>
+              <w:top w:w="80" w:type="dxa"/>
+              <w:bottom w:w="80" w:type="dxa"/>
+              <w:left w:w="100" w:type="dxa"/>
+              <w:right w:w="100" w:type="dxa"/>
+            </w:tcMar>
+            <w:shd w:fill="F2F6FA"/>
+          </w:tcPr>
+          <w:p>
+            <w:pPr>
+              <w:spacing w:after="100"/>
+            </w:pPr>
+            <w:r>
+              <w:rPr>
+                <w:rFonts w:ascii="Arial" w:hAnsi="Arial" w:eastAsia="Arial" w:cs="Arial"/>
+                <w:color w:val="000000"/>
+                <w:sz w:val="22"/>
+              </w:rPr>
+              <w:t>Phối hợp CMS; không suy ra lịch chung kết</w:t>
+            </w:r>
+          </w:p>
+        </w:tc>
+      </w:tr>
+    </w:tbl>
+    <w:p>
+      <w:pPr>
+        <w:pStyle w:val="Heading2"/>
+      </w:pPr>
+      <w:r>
+        <w:t>Trạng thái bàn giao</w:t>
+      </w:r>
+    </w:p>
+    <w:p>
+      <w:pPr>
+        <w:spacing w:after="100"/>
+      </w:pPr>
+      <w:r>
+        <w:rPr>
+          <w:rFonts w:ascii="Arial" w:hAnsi="Arial" w:eastAsia="Arial" w:cs="Arial"/>
+          <w:color w:val="000000"/>
+          <w:sz w:val="22"/>
+        </w:rPr>
+        <w:t>Nghiệm thu local 11/11 giữ nguyên. Database Supabase đã đồng bộ; báo cáo tại docs/supabase-sync-20261014.md. Code ở nhánh web_ftu chưa commit/push/deploy. Còn tài khoản quản trị, cấu hình BTC và tích hợp Cloudflare trước vận hành thật.</w:t>
       </w:r>
     </w:p>
     <w:sectPr>

</xml_diff>